<commit_message>
Implement resume viewer and downloader
</commit_message>
<xml_diff>
--- a/resources/resume/2026 resume template.docx
+++ b/resources/resume/2026 resume template.docx
@@ -145,8 +145,19 @@
                                   <w:sz w:val="22"/>
                                   <w:u w:val="none"/>
                                 </w:rPr>
-                                <w:t>linkedin.com/in/jasonvertucio</w:t>
+                                <w:t>linkedin.com/in/</w:t>
                               </w:r>
+                              <w:proofErr w:type="spellStart"/>
+                              <w:r>
+                                <w:rPr>
+                                  <w:rStyle w:val="Hyperlink"/>
+                                  <w:color w:val="auto"/>
+                                  <w:sz w:val="22"/>
+                                  <w:u w:val="none"/>
+                                </w:rPr>
+                                <w:t>jasonvertucio</w:t>
+                              </w:r>
+                              <w:proofErr w:type="spellEnd"/>
                             </w:hyperlink>
                           </w:p>
                         </w:txbxContent>
@@ -246,8 +257,19 @@
                             <w:sz w:val="22"/>
                             <w:u w:val="none"/>
                           </w:rPr>
-                          <w:t>linkedin.com/in/jasonvertucio</w:t>
+                          <w:t>linkedin.com/in/</w:t>
                         </w:r>
+                        <w:proofErr w:type="spellStart"/>
+                        <w:r>
+                          <w:rPr>
+                            <w:rStyle w:val="Hyperlink"/>
+                            <w:color w:val="auto"/>
+                            <w:sz w:val="22"/>
+                            <w:u w:val="none"/>
+                          </w:rPr>
+                          <w:t>jasonvertucio</w:t>
+                        </w:r>
+                        <w:proofErr w:type="spellEnd"/>
                       </w:hyperlink>
                     </w:p>
                   </w:txbxContent>
@@ -281,46 +303,6 @@
     <w:p>
       <w:pPr>
         <w:pStyle w:val="Heading1"/>
-      </w:pPr>
-      <w:r>
-        <w:t>TECHNICAL SKILLS</w:t>
-      </w:r>
-    </w:p>
-    <w:p>
-      <w:pPr>
-        <w:pStyle w:val="Heading2"/>
-      </w:pPr>
-      <w:r>
-        <w:t>Architecture &amp; Tools</w:t>
-      </w:r>
-    </w:p>
-    <w:p>
-      <w:r>
-        <w:t>Design Systems, Component Libraries, Micro-Frontends,</w:t>
-      </w:r>
-      <w:r>
-        <w:t xml:space="preserve"> </w:t>
-      </w:r>
-      <w:r>
-        <w:t>Low-Code/No-Code Tooling, Custom DSL Development</w:t>
-      </w:r>
-      <w:r>
-        <w:t>,</w:t>
-      </w:r>
-      <w:r>
-        <w:t xml:space="preserve"> SSR, API Integration (REST, GraphQL), Git, Agile/Scrum, Web Performance Optimization, </w:t>
-      </w:r>
-      <w:r>
-        <w:t xml:space="preserve">Built Tools (Vite, Webpack), Code Quality (ESLint, Prettier), </w:t>
-      </w:r>
-      <w:r>
-        <w:t>AI-Assisted Development (Claude Code, GitHub Copilot)</w:t>
-      </w:r>
-    </w:p>
-    <w:p/>
-    <w:p>
-      <w:pPr>
-        <w:pStyle w:val="Heading2"/>
         <w:sectPr>
           <w:type w:val="continuous"/>
           <w:pgSz w:w="11906" w:h="16838"/>
@@ -329,234 +311,20 @@
           <w:docGrid w:linePitch="360"/>
         </w:sectPr>
       </w:pPr>
+      <w:r>
+        <w:t>TECHNICAL SKILLS</w:t>
+      </w:r>
     </w:p>
     <w:p>
       <w:pPr>
         <w:pStyle w:val="Heading2"/>
       </w:pPr>
       <w:r>
-        <w:t>Testing &amp; Quality</w:t>
-      </w:r>
-    </w:p>
-    <w:p>
-      <w:r>
-        <w:t xml:space="preserve">TDD, </w:t>
-      </w:r>
-      <w:r>
-        <w:t>Unit Testing, E2E Testing, Web Accessibility (WCAG 2.1 AA — 508 Compliance)</w:t>
-      </w:r>
-      <w:r>
-        <w:t xml:space="preserve">, </w:t>
-      </w:r>
-      <w:r>
-        <w:t xml:space="preserve">Jest, Vue Test Utils, </w:t>
-      </w:r>
-      <w:r>
-        <w:t>Cypress</w:t>
-      </w:r>
-      <w:r>
-        <w:t>,</w:t>
-      </w:r>
-      <w:r>
-        <w:t xml:space="preserve"> Playwright, PHPUnit </w:t>
-      </w:r>
-    </w:p>
-    <w:p>
-      <w:pPr>
-        <w:pStyle w:val="Heading2"/>
-      </w:pPr>
-      <w:r>
-        <w:t>State Management</w:t>
-      </w:r>
-    </w:p>
-    <w:p>
-      <w:r>
-        <w:t>Vuex, Pinia</w:t>
-      </w:r>
-      <w:r>
-        <w:t xml:space="preserve">, </w:t>
-      </w:r>
-      <w:r>
-        <w:t>Redux, Context API</w:t>
-      </w:r>
-    </w:p>
-    <w:p>
-      <w:pPr>
-        <w:pStyle w:val="Heading2"/>
-      </w:pPr>
-      <w:r>
-        <w:t>Front-End</w:t>
-      </w:r>
-    </w:p>
-    <w:p>
-      <w:r>
-        <w:t xml:space="preserve">TypeScript, JavaScript, React, Next.js, </w:t>
-      </w:r>
-      <w:r>
-        <w:t>Vue</w:t>
-      </w:r>
-      <w:r>
-        <w:t xml:space="preserve">, </w:t>
-      </w:r>
-      <w:r>
-        <w:t xml:space="preserve">Angular, </w:t>
-      </w:r>
-      <w:r>
-        <w:t>inertia.js, LIvewire</w:t>
-      </w:r>
-      <w:r>
-        <w:t>, HTML5, CSS3, Tailwind CSS, SCSS</w:t>
-      </w:r>
-    </w:p>
-    <w:p>
-      <w:pPr>
-        <w:pStyle w:val="Heading2"/>
-      </w:pPr>
-      <w:r>
-        <w:t>UI Component Libraries</w:t>
-      </w:r>
-    </w:p>
-    <w:p>
-      <w:r>
-        <w:t>MUI, PrimeVue</w:t>
-      </w:r>
-      <w:r>
-        <w:t>, Vuetify, Quasar</w:t>
-      </w:r>
-      <w:r>
-        <w:t>, KendoUI</w:t>
-      </w:r>
-    </w:p>
-    <w:p>
-      <w:pPr>
-        <w:pStyle w:val="Heading2"/>
-      </w:pPr>
-      <w:r>
-        <w:t>Mobile Development</w:t>
-      </w:r>
-    </w:p>
-    <w:p>
-      <w:r>
-        <w:t>React Native, Expo, Ionic, Capacitor</w:t>
-      </w:r>
-      <w:r>
-        <w:t>, Cordova</w:t>
-      </w:r>
-    </w:p>
-    <w:p>
-      <w:pPr>
-        <w:pStyle w:val="Heading2"/>
-      </w:pPr>
-      <w:r>
-        <w:t>Backend &amp; Databases</w:t>
-      </w:r>
-    </w:p>
-    <w:p>
-      <w:r>
-        <w:t>Node.js, Express, Laravel, .NET, MySQL, T-SQL</w:t>
-      </w:r>
-    </w:p>
-    <w:p>
-      <w:pPr>
-        <w:pStyle w:val="Heading1"/>
-        <w:sectPr>
-          <w:type w:val="continuous"/>
-          <w:pgSz w:w="11906" w:h="16838"/>
-          <w:pgMar w:top="1440" w:right="720" w:bottom="540" w:left="720" w:header="708" w:footer="708" w:gutter="0"/>
-          <w:cols w:num="2" w:space="720"/>
-          <w:docGrid w:linePitch="360"/>
-        </w:sectPr>
-      </w:pPr>
-    </w:p>
-    <w:p>
-      <w:pPr>
-        <w:pStyle w:val="Heading1"/>
-      </w:pPr>
-      <w:r>
-        <w:t>PROFESSIONAL EXPERIENCE</w:t>
-      </w:r>
-    </w:p>
-    <w:p>
-      <w:r>
-        <w:t>{#experience}</w:t>
-      </w:r>
-    </w:p>
-    <w:p>
-      <w:pPr>
-        <w:pStyle w:val="JobTitle"/>
-      </w:pPr>
-      <w:r>
-        <w:t>{jobTitle}</w:t>
-      </w:r>
-    </w:p>
-    <w:p>
-      <w:pPr>
-        <w:pStyle w:val="CompanyInfo"/>
-      </w:pPr>
-      <w:r>
-        <w:t xml:space="preserve">{company} </w:t>
-      </w:r>
-      <w:r>
-        <w:rPr>
-          <w:color w:val="666666"/>
-        </w:rPr>
-        <w:t>•</w:t>
-      </w:r>
-      <w:r>
-        <w:t xml:space="preserve"> {dates</w:t>
-      </w:r>
-      <w:r>
-        <w:t xml:space="preserve">[0]} </w:t>
-      </w:r>
-      <w:r>
-        <w:t>–</w:t>
-      </w:r>
-      <w:r>
-        <w:t xml:space="preserve"> {dates[1]</w:t>
-      </w:r>
-      <w:r>
-        <w:t xml:space="preserve"> </w:t>
-      </w:r>
-      <w:r>
-        <w:rPr>
-          <w:color w:val="666666"/>
-        </w:rPr>
-        <w:t>•</w:t>
-      </w:r>
-      <w:r>
-        <w:t xml:space="preserve"> {location}</w:t>
-      </w:r>
-    </w:p>
-    <w:p>
-      <w:pPr>
-        <w:pStyle w:val="KeyTechnologies"/>
-      </w:pPr>
-      <w:r>
-        <w:t>{#bullets}</w:t>
-      </w:r>
-    </w:p>
-    <w:p>
-      <w:pPr>
-        <w:pStyle w:val="ListParagraph"/>
-      </w:pPr>
-      <w:r>
-        <w:t>{.}</w:t>
-      </w:r>
-    </w:p>
-    <w:p>
-      <w:r>
-        <w:t>{/bullets}</w:t>
-      </w:r>
-    </w:p>
-    <w:p>
-      <w:r>
-        <w:t>{/experience}</w:t>
-      </w:r>
-    </w:p>
-    <w:p>
-      <w:pPr>
-        <w:pStyle w:val="CompanyInfo"/>
-      </w:pPr>
+        <w:t>{#skills}{#top}</w:t>
+      </w:r>
+      <w:r>
+        <w:t>{title}</w:t>
+      </w:r>
     </w:p>
     <w:p>
       <w:pPr>
@@ -569,6 +337,208 @@
           <w:docGrid w:linePitch="360"/>
         </w:sectPr>
       </w:pPr>
+      <w:proofErr w:type="gramStart"/>
+      <w:r>
+        <w:t>{</w:t>
+      </w:r>
+      <w:proofErr w:type="spellStart"/>
+      <w:r>
+        <w:t>listJoined</w:t>
+      </w:r>
+      <w:proofErr w:type="spellEnd"/>
+      <w:r>
+        <w:t>}{/</w:t>
+      </w:r>
+      <w:proofErr w:type="gramEnd"/>
+      <w:r>
+        <w:t>top}</w:t>
+      </w:r>
+    </w:p>
+    <w:p>
+      <w:r>
+        <w:t>{#other}</w:t>
+      </w:r>
+    </w:p>
+    <w:p>
+      <w:pPr>
+        <w:pStyle w:val="Heading2"/>
+      </w:pPr>
+      <w:r>
+        <w:t>{title}</w:t>
+      </w:r>
+    </w:p>
+    <w:p>
+      <w:r>
+        <w:t>{</w:t>
+      </w:r>
+      <w:proofErr w:type="spellStart"/>
+      <w:r>
+        <w:t>listJoined</w:t>
+      </w:r>
+      <w:proofErr w:type="spellEnd"/>
+      <w:r>
+        <w:t>}</w:t>
+      </w:r>
+    </w:p>
+    <w:p>
+      <w:r>
+        <w:t>{/other}</w:t>
+      </w:r>
+    </w:p>
+    <w:p>
+      <w:pPr>
+        <w:sectPr>
+          <w:type w:val="continuous"/>
+          <w:pgSz w:w="11906" w:h="16838"/>
+          <w:pgMar w:top="900" w:right="720" w:bottom="540" w:left="720" w:header="708" w:footer="708" w:gutter="0"/>
+          <w:cols w:num="2" w:space="720"/>
+          <w:docGrid w:linePitch="360"/>
+        </w:sectPr>
+      </w:pPr>
+    </w:p>
+    <w:p>
+      <w:r>
+        <w:t>{/skills}</w:t>
+      </w:r>
+    </w:p>
+    <w:p>
+      <w:pPr>
+        <w:pStyle w:val="Heading1"/>
+      </w:pPr>
+      <w:r>
+        <w:t>PROFESSIONAL EXPERIENCE</w:t>
+      </w:r>
+    </w:p>
+    <w:p>
+      <w:pPr>
+        <w:pStyle w:val="Heading1"/>
+        <w:sectPr>
+          <w:type w:val="continuous"/>
+          <w:pgSz w:w="11906" w:h="16838"/>
+          <w:pgMar w:top="900" w:right="720" w:bottom="540" w:left="720" w:header="708" w:footer="708" w:gutter="0"/>
+          <w:cols w:space="720"/>
+          <w:docGrid w:linePitch="360"/>
+        </w:sectPr>
+      </w:pPr>
+    </w:p>
+    <w:p>
+      <w:r>
+        <w:t>{#experience}</w:t>
+      </w:r>
+    </w:p>
+    <w:p>
+      <w:pPr>
+        <w:pStyle w:val="JobTitle"/>
+      </w:pPr>
+      <w:r>
+        <w:t>{</w:t>
+      </w:r>
+      <w:proofErr w:type="spellStart"/>
+      <w:r>
+        <w:t>jobTitle</w:t>
+      </w:r>
+      <w:proofErr w:type="spellEnd"/>
+      <w:r>
+        <w:t>}</w:t>
+      </w:r>
+    </w:p>
+    <w:p>
+      <w:pPr>
+        <w:pStyle w:val="CompanyInfo"/>
+      </w:pPr>
+      <w:r>
+        <w:t xml:space="preserve">{company} </w:t>
+      </w:r>
+      <w:r>
+        <w:rPr>
+          <w:color w:val="666666"/>
+        </w:rPr>
+        <w:t>•</w:t>
+      </w:r>
+      <w:r>
+        <w:t xml:space="preserve"> </w:t>
+      </w:r>
+      <w:r>
+        <w:t>{</w:t>
+      </w:r>
+      <w:proofErr w:type="spellStart"/>
+      <w:r>
+        <w:t>dateStart</w:t>
+      </w:r>
+      <w:proofErr w:type="spellEnd"/>
+      <w:r>
+        <w:t xml:space="preserve">} </w:t>
+      </w:r>
+      <w:r>
+        <w:t>–</w:t>
+      </w:r>
+      <w:r>
+        <w:t xml:space="preserve"> {</w:t>
+      </w:r>
+      <w:proofErr w:type="spellStart"/>
+      <w:r>
+        <w:t>dateend</w:t>
+      </w:r>
+      <w:proofErr w:type="spellEnd"/>
+      <w:r>
+        <w:t>}</w:t>
+      </w:r>
+      <w:r>
+        <w:t xml:space="preserve"> </w:t>
+      </w:r>
+      <w:r>
+        <w:rPr>
+          <w:color w:val="666666"/>
+        </w:rPr>
+        <w:t>•</w:t>
+      </w:r>
+      <w:r>
+        <w:t xml:space="preserve"> {location}</w:t>
+      </w:r>
+    </w:p>
+    <w:p>
+      <w:pPr>
+        <w:pStyle w:val="KeyTechnologies"/>
+      </w:pPr>
+      <w:r>
+        <w:t>{#bullets}</w:t>
+      </w:r>
+    </w:p>
+    <w:p>
+      <w:pPr>
+        <w:pStyle w:val="ListParagraph"/>
+      </w:pPr>
+      <w:proofErr w:type="gramStart"/>
+      <w:r>
+        <w:t>{.}</w:t>
+      </w:r>
+      <w:proofErr w:type="gramEnd"/>
+    </w:p>
+    <w:p>
+      <w:r>
+        <w:t>{/bullets}</w:t>
+      </w:r>
+    </w:p>
+    <w:p>
+      <w:r>
+        <w:t>{/experience}</w:t>
+      </w:r>
+    </w:p>
+    <w:p>
+      <w:pPr>
+        <w:pStyle w:val="CompanyInfo"/>
+      </w:pPr>
+    </w:p>
+    <w:p>
+      <w:pPr>
+        <w:sectPr>
+          <w:type w:val="continuous"/>
+          <w:pgSz w:w="11906" w:h="16838"/>
+          <w:pgMar w:top="900" w:right="720" w:bottom="540" w:left="720" w:header="708" w:footer="708" w:gutter="0"/>
+          <w:cols w:space="720"/>
+          <w:docGrid w:linePitch="360"/>
+        </w:sectPr>
+      </w:pPr>
     </w:p>
     <w:p>
       <w:pPr>
@@ -581,31 +551,28 @@
       </w:r>
     </w:p>
     <w:p>
-      <w:pPr>
-        <w:pStyle w:val="CompanyInfo"/>
-        <w:rPr>
-          <w:b/>
-          <w:i w:val="0"/>
-          <w:iCs w:val="0"/>
-          <w:color w:val="1B587C"/>
-          <w:sz w:val="22"/>
-        </w:rPr>
-      </w:pPr>
-      <w:r>
-        <w:rPr>
-          <w:b/>
-          <w:i w:val="0"/>
-          <w:iCs w:val="0"/>
-          <w:color w:val="1B587C"/>
-          <w:sz w:val="22"/>
-        </w:rPr>
-        <w:t>The Bootstrap Paradox, LLC</w:t>
-      </w:r>
-    </w:p>
-    <w:p>
-      <w:pPr>
-        <w:keepNext/>
-        <w:keepLines/>
+      <w:r>
+        <w:t>{#projects}</w:t>
+      </w:r>
+    </w:p>
+    <w:p>
+      <w:pPr>
+        <w:pStyle w:val="JobTitle"/>
+      </w:pPr>
+      <w:r>
+        <w:t>{</w:t>
+      </w:r>
+      <w:proofErr w:type="spellStart"/>
+      <w:r>
+        <w:t>projectName</w:t>
+      </w:r>
+      <w:proofErr w:type="spellEnd"/>
+      <w:r>
+        <w:t>}</w:t>
+      </w:r>
+    </w:p>
+    <w:p>
+      <w:pPr>
         <w:rPr>
           <w:b/>
           <w:bCs/>
@@ -616,21 +583,26 @@
           <w:b/>
           <w:bCs/>
         </w:rPr>
-        <w:t>Personal and client projects</w:t>
+        <w:t>{#description}</w:t>
       </w:r>
       <w:r>
         <w:rPr>
           <w:b/>
           <w:bCs/>
         </w:rPr>
-        <w:t>,</w:t>
+        <w:t>{description}</w:t>
       </w:r>
       <w:r>
         <w:rPr>
           <w:b/>
           <w:bCs/>
         </w:rPr>
-        <w:t xml:space="preserve"> demonstrating ongoing technical exploration and full-stack capabilities.</w:t>
+        <w:t>{/description}</w:t>
+      </w:r>
+    </w:p>
+    <w:p>
+      <w:r>
+        <w:t>{#bullets}</w:t>
       </w:r>
     </w:p>
     <w:p>
@@ -642,319 +614,26 @@
         </w:numPr>
         <w:ind w:left="360"/>
       </w:pPr>
-      <w:r>
-        <w:t xml:space="preserve">Created </w:t>
-      </w:r>
-      <w:hyperlink r:id="rId15" w:history="1">
-        <w:r>
-          <w:rPr>
-            <w:rStyle w:val="Hyperlink"/>
-          </w:rPr>
-          <w:t>bspdx/AuthKit</w:t>
-        </w:r>
-      </w:hyperlink>
-      <w:r>
-        <w:t xml:space="preserve"> to standardize 2FA + passkey authentication and RBAC in Laravel. </w:t>
-      </w:r>
-    </w:p>
-    <w:p>
-      <w:pPr>
-        <w:pStyle w:val="ListParagraph"/>
-        <w:numPr>
-          <w:ilvl w:val="0"/>
-          <w:numId w:val="4"/>
-        </w:numPr>
-        <w:ind w:left="360"/>
-      </w:pPr>
-      <w:r>
-        <w:t>Migrated site to Inertia.js/Vue 3 architecture, modernizing front-end while maintaining Laravel backend infrastructure</w:t>
-      </w:r>
-      <w:r>
-        <w:t>.</w:t>
-      </w:r>
-    </w:p>
-    <w:p>
-      <w:pPr>
-        <w:pStyle w:val="ListParagraph"/>
-        <w:numPr>
-          <w:ilvl w:val="0"/>
-          <w:numId w:val="4"/>
-        </w:numPr>
-        <w:ind w:left="360"/>
-      </w:pPr>
-      <w:r>
-        <w:t>Built custom URL shortening service with integrated analytics tracking for link management and engagement metrics</w:t>
-      </w:r>
-      <w:r>
-        <w:t>.</w:t>
-      </w:r>
-    </w:p>
-    <w:p>
-      <w:pPr>
-        <w:pStyle w:val="ListParagraph"/>
-        <w:numPr>
-          <w:ilvl w:val="0"/>
-          <w:numId w:val="4"/>
-        </w:numPr>
-        <w:ind w:left="360"/>
-      </w:pPr>
-      <w:r>
-        <w:t>Deployed self-hosted analytics solution, replacing third-party dependencies and improving data privacy compliance</w:t>
-      </w:r>
-    </w:p>
-    <w:p>
-      <w:pPr>
-        <w:pStyle w:val="ListParagraph"/>
-        <w:numPr>
-          <w:ilvl w:val="0"/>
-          <w:numId w:val="4"/>
-        </w:numPr>
-        <w:ind w:left="360"/>
-      </w:pPr>
-      <w:r>
-        <w:t xml:space="preserve">Configured automated security monitoring with custom honeypot integration on contact forms, protecting against </w:t>
-      </w:r>
-      <w:r>
-        <w:t xml:space="preserve">both standard </w:t>
-      </w:r>
-      <w:r>
-        <w:t>HTTP attack vectors and bot</w:t>
-      </w:r>
-      <w:r>
-        <w:t xml:space="preserve">-generated </w:t>
-      </w:r>
-      <w:r>
-        <w:t>submission attempts</w:t>
-      </w:r>
-      <w:r>
-        <w:t>.</w:t>
-      </w:r>
-    </w:p>
-    <w:p>
-      <w:pPr>
-        <w:pStyle w:val="JobTitle"/>
-      </w:pPr>
-      <w:r>
-        <w:t>PSMF</w:t>
-      </w:r>
-    </w:p>
-    <w:p>
-      <w:pPr>
-        <w:pStyle w:val="ListParagraph"/>
-      </w:pPr>
-      <w:r>
-        <w:t>Buil</w:t>
-      </w:r>
-      <w:r>
-        <w:t>ding</w:t>
-      </w:r>
-      <w:r>
-        <w:t xml:space="preserve"> </w:t>
-      </w:r>
-      <w:r>
-        <w:t>complete multitenant web application using AI-assisted development workflow: leveraging Claude Code and GitHub Copilot for baseline code generation (~70-80%), then reviewing, refining, and establishing architectural patterns for production quality.</w:t>
-      </w:r>
-    </w:p>
-    <w:p>
-      <w:pPr>
-        <w:pStyle w:val="ListParagraph"/>
-      </w:pPr>
-      <w:r>
-        <w:t>Design</w:t>
-      </w:r>
-      <w:r>
-        <w:t>ing</w:t>
-      </w:r>
-      <w:r>
-        <w:t xml:space="preserve"> scalable database architecture and system infrastructure </w:t>
-      </w:r>
-      <w:r>
-        <w:t xml:space="preserve">that </w:t>
-      </w:r>
-      <w:r>
-        <w:t>support</w:t>
-      </w:r>
-      <w:r>
-        <w:t>s</w:t>
-      </w:r>
-      <w:r>
-        <w:t xml:space="preserve"> multiple client tenants with isolated data and customizable features.</w:t>
-      </w:r>
-    </w:p>
-    <w:p>
-      <w:pPr>
-        <w:pStyle w:val="ListParagraph"/>
-      </w:pPr>
-      <w:r>
-        <w:t>Document</w:t>
-      </w:r>
-      <w:r>
-        <w:t>ing</w:t>
-      </w:r>
-      <w:r>
-        <w:t xml:space="preserve"> technical specifications, API contracts, and development patterns to ensure maintainability and team scalability</w:t>
-      </w:r>
-      <w:r>
-        <w:t>.</w:t>
-      </w:r>
-    </w:p>
-    <w:p>
-      <w:pPr>
-        <w:pStyle w:val="JobTitle"/>
-        <w:tabs>
-          <w:tab w:val="left" w:pos="5893"/>
-        </w:tabs>
-      </w:pPr>
-      <w:r>
-        <w:t>Ghost Letter</w:t>
-      </w:r>
-    </w:p>
-    <w:p>
-      <w:pPr>
-        <w:pStyle w:val="ListParagraph"/>
-      </w:pPr>
-      <w:r>
-        <w:t>Architected full-stack application using AI-assisted development (Claude Code, GitHub Copilot) for rapid prototyping, applying manual review and architectural patterns to ensure production-grade code quality</w:t>
-      </w:r>
-      <w:r>
-        <w:t>.</w:t>
-      </w:r>
-    </w:p>
-    <w:p>
-      <w:pPr>
-        <w:pStyle w:val="ListParagraph"/>
-      </w:pPr>
-      <w:r>
-        <w:t>Implemented comprehensive testing with PHPUnit for Laravel backend validation and Playwright for automated E2E testing, ensuring code reliability and preventing regressions across deployments</w:t>
-      </w:r>
-      <w:r>
-        <w:t>.</w:t>
-      </w:r>
-    </w:p>
-    <w:p>
-      <w:pPr>
-        <w:pStyle w:val="ListParagraph"/>
-      </w:pPr>
-      <w:r>
-        <w:t>Designed reusable frontend component architecture and RESTful API contracts, establishing clear separation of concerns between Laravel backend and React frontend.</w:t>
-      </w:r>
-    </w:p>
-    <w:p>
-      <w:pPr>
-        <w:pStyle w:val="JobTitle"/>
-      </w:pPr>
-      <w:r>
-        <w:t>BalanceCloud</w:t>
-      </w:r>
-    </w:p>
-    <w:p>
-      <w:pPr>
-        <w:pStyle w:val="ListParagraph"/>
-      </w:pPr>
-      <w:r>
-        <w:t xml:space="preserve">Architected and developed privacy-first </w:t>
-      </w:r>
-      <w:r>
-        <w:t>digital ledger</w:t>
-      </w:r>
-      <w:r>
-        <w:t xml:space="preserve"> PWA, with client-side data management</w:t>
-      </w:r>
-      <w:r>
-        <w:t xml:space="preserve">, </w:t>
-      </w:r>
-      <w:r>
-        <w:t>privacy-by-design principles</w:t>
-      </w:r>
-      <w:r>
-        <w:t>,</w:t>
-      </w:r>
-      <w:r>
-        <w:t xml:space="preserve"> and cross-device synchronization capabilities</w:t>
-      </w:r>
-      <w:r>
-        <w:t>.</w:t>
-      </w:r>
-    </w:p>
-    <w:p>
-      <w:pPr>
-        <w:pStyle w:val="ListParagraph"/>
-      </w:pPr>
-      <w:r>
-        <w:t>Migrated</w:t>
-      </w:r>
-      <w:r>
-        <w:t xml:space="preserve"> backend</w:t>
-      </w:r>
-      <w:r>
-        <w:t xml:space="preserve"> from Laravel 7 to Laravel 12 over the course of the past 5 years.</w:t>
-      </w:r>
-    </w:p>
-    <w:p>
-      <w:pPr>
-        <w:pStyle w:val="ListParagraph"/>
-      </w:pPr>
-      <w:r>
-        <w:t>B</w:t>
-      </w:r>
-      <w:r>
-        <w:t xml:space="preserve">uilt </w:t>
-      </w:r>
-      <w:r>
-        <w:t>responsive administrative dashboard with Chart.js visualizations for real-time usage analytics and user engagement metrics.</w:t>
-      </w:r>
-    </w:p>
-    <w:p>
-      <w:pPr>
-        <w:pStyle w:val="JobTitle"/>
-      </w:pPr>
-      <w:r>
-        <w:t xml:space="preserve">Review the Pew </w:t>
-      </w:r>
-    </w:p>
-    <w:p>
-      <w:pPr>
-        <w:pStyle w:val="ListParagraph"/>
-      </w:pPr>
-      <w:r>
-        <w:t xml:space="preserve">System Administrator and Full-Stack Developer </w:t>
-      </w:r>
-    </w:p>
-    <w:p>
-      <w:pPr>
-        <w:pStyle w:val="ListParagraph"/>
-      </w:pPr>
-      <w:r>
-        <w:t>Manage complete Linux server infrastructure for product review platform.</w:t>
-      </w:r>
-    </w:p>
-    <w:p>
-      <w:pPr>
-        <w:pStyle w:val="ListParagraph"/>
-      </w:pPr>
-      <w:r>
-        <w:t>Develop</w:t>
-      </w:r>
-      <w:r>
-        <w:t>ed</w:t>
-      </w:r>
-      <w:r>
-        <w:t xml:space="preserve"> custom WordPress integrations and standalone web applications to enhance platform functionality.</w:t>
-      </w:r>
-    </w:p>
-    <w:p>
-      <w:pPr>
-        <w:pStyle w:val="ListParagraph"/>
-      </w:pPr>
-      <w:r>
-        <w:t xml:space="preserve">Built cross-platform </w:t>
-      </w:r>
-      <w:r>
-        <w:t xml:space="preserve">React Native/Expo </w:t>
-      </w:r>
-      <w:r>
-        <w:t>mobile app, handling full development lifecycle from design to deployment.</w:t>
-      </w:r>
+      <w:proofErr w:type="gramStart"/>
+      <w:r>
+        <w:t>{.}</w:t>
+      </w:r>
+      <w:proofErr w:type="gramEnd"/>
+    </w:p>
+    <w:p>
+      <w:r>
+        <w:t>{/bullets}</w:t>
+      </w:r>
+    </w:p>
+    <w:p>
+      <w:r>
+        <w:t>{/projects}</w:t>
+      </w:r>
+    </w:p>
+    <w:p>
+      <w:pPr>
+        <w:ind w:left="360" w:hanging="360"/>
+      </w:pPr>
     </w:p>
     <w:p>
       <w:pPr>
@@ -976,11 +655,16 @@
       </w:r>
     </w:p>
     <w:p>
+      <w:r>
+        <w:t>{#education}</w:t>
+      </w:r>
+    </w:p>
+    <w:p>
       <w:pPr>
         <w:pStyle w:val="JobTitle"/>
       </w:pPr>
       <w:r>
-        <w:t>Drexel University</w:t>
+        <w:t>{institution}</w:t>
       </w:r>
     </w:p>
     <w:p>
@@ -988,15 +672,45 @@
         <w:pStyle w:val="CompanyInfo"/>
       </w:pPr>
       <w:r>
-        <w:t>Computer Science Coursework • 1996 – 1999</w:t>
-      </w:r>
-    </w:p>
-    <w:p>
-      <w:pPr>
-        <w:ind w:left="360" w:hanging="360"/>
-      </w:pPr>
-      <w:r>
-        <w:t>Foundational coursework in programming and software development</w:t>
+        <w:t>{degree}</w:t>
+      </w:r>
+      <w:r>
+        <w:t xml:space="preserve"> • </w:t>
+      </w:r>
+      <w:r>
+        <w:t>{</w:t>
+      </w:r>
+      <w:proofErr w:type="spellStart"/>
+      <w:r>
+        <w:t>dateStart</w:t>
+      </w:r>
+      <w:proofErr w:type="spellEnd"/>
+      <w:r>
+        <w:t>}</w:t>
+      </w:r>
+      <w:r>
+        <w:t xml:space="preserve"> – </w:t>
+      </w:r>
+      <w:r>
+        <w:t>{</w:t>
+      </w:r>
+      <w:proofErr w:type="spellStart"/>
+      <w:r>
+        <w:t>dateEnd</w:t>
+      </w:r>
+      <w:proofErr w:type="spellEnd"/>
+      <w:r>
+        <w:t>}</w:t>
+      </w:r>
+    </w:p>
+    <w:p>
+      <w:r>
+        <w:t>{description}</w:t>
+      </w:r>
+    </w:p>
+    <w:p>
+      <w:r>
+        <w:t>{/education}</w:t>
       </w:r>
     </w:p>
     <w:p/>
@@ -1024,37 +738,49 @@
       </w:r>
     </w:p>
     <w:p>
+      <w:r>
+        <w:t>{#technicalProfile}</w:t>
+      </w:r>
+    </w:p>
+    <w:p>
       <w:pPr>
         <w:pStyle w:val="Heading2"/>
       </w:pPr>
       <w:r>
-        <w:t>Domain Expertise &amp; Industry Experience</w:t>
-      </w:r>
-    </w:p>
-    <w:p>
-      <w:pPr>
-        <w:jc w:val="both"/>
-      </w:pPr>
-      <w:r>
-        <w:t>Enterprise SaaS Applications • B2B Software Platforms • B2C Consumer Applications</w:t>
-      </w:r>
-      <w:r>
-        <w:t xml:space="preserve"> • </w:t>
-      </w:r>
-      <w:r>
-        <w:t>Regulatory Compliance Software • Fleet Management Systems • Automotive Technology</w:t>
-      </w:r>
-      <w:r>
-        <w:t xml:space="preserve"> • </w:t>
-      </w:r>
-      <w:r>
-        <w:t>Dealership Management Platforms • Streaming Entertainment • Digital Content Distribution</w:t>
-      </w:r>
-      <w:r>
-        <w:t xml:space="preserve"> • </w:t>
-      </w:r>
-      <w:r>
-        <w:t>Multi-Tenant Architecture • Design Systems • Legacy Application Modernization</w:t>
+        <w:t>{</w:t>
+      </w:r>
+      <w:proofErr w:type="spellStart"/>
+      <w:r>
+        <w:t>main.</w:t>
+      </w:r>
+      <w:r>
+        <w:t>category</w:t>
+      </w:r>
+      <w:proofErr w:type="spellEnd"/>
+      <w:r>
+        <w:t>}</w:t>
+      </w:r>
+    </w:p>
+    <w:p>
+      <w:r>
+        <w:t>{</w:t>
+      </w:r>
+      <w:proofErr w:type="spellStart"/>
+      <w:r>
+        <w:t>main.</w:t>
+      </w:r>
+      <w:r>
+        <w:t>listJoined</w:t>
+      </w:r>
+      <w:proofErr w:type="spellEnd"/>
+      <w:r>
+        <w:t>}</w:t>
+      </w:r>
+    </w:p>
+    <w:p/>
+    <w:p>
+      <w:r>
+        <w:t>{#secondary}</w:t>
       </w:r>
     </w:p>
     <w:p>
@@ -1062,696 +788,59 @@
         <w:pStyle w:val="Heading2"/>
       </w:pPr>
       <w:r>
-        <w:t>Frontend Architecture &amp; Frameworks</w:t>
-      </w:r>
-    </w:p>
-    <w:p>
-      <w:r>
-        <w:t>Vue</w:t>
-      </w:r>
-      <w:r>
-        <w:t>/Vue.js</w:t>
-      </w:r>
-      <w:r>
-        <w:t xml:space="preserve"> (6 years) – AMCS/Dossier Systems, ERM, BalanceCloud, Bootstrap Paradox, PSMF</w:t>
-      </w:r>
-    </w:p>
-    <w:p>
-      <w:r>
-        <w:t>TypeScript (4 years) – AMCS/Dossier Systems, Subaru of America</w:t>
-      </w:r>
-    </w:p>
-    <w:p>
-      <w:r>
-        <w:t>React (</w:t>
-      </w:r>
-      <w:r>
-        <w:t>2</w:t>
-      </w:r>
-      <w:r>
-        <w:t xml:space="preserve"> year</w:t>
-      </w:r>
-      <w:r>
-        <w:t>s</w:t>
-      </w:r>
-      <w:r>
-        <w:t>) – Subaru of America, Ghost Letter</w:t>
-      </w:r>
-      <w:r>
-        <w:t>, Review the Pew</w:t>
-      </w:r>
-    </w:p>
-    <w:p>
-      <w:r>
-        <w:t>Next.js (0.3 years) – Subaru of America, Ghost Letter</w:t>
-      </w:r>
-    </w:p>
-    <w:p>
-      <w:r>
-        <w:t>Angular</w:t>
-      </w:r>
-      <w:r>
-        <w:t xml:space="preserve">/AngularJS </w:t>
+        <w:t>{category}</w:t>
+      </w:r>
+    </w:p>
+    <w:p>
+      <w:r>
+        <w:t>{#skills}</w:t>
+      </w:r>
+    </w:p>
+    <w:p>
+      <w:r>
+        <w:t xml:space="preserve">{skill} </w:t>
+      </w:r>
+      <w:r>
+        <w:t>{#years}</w:t>
       </w:r>
       <w:r>
         <w:t>(</w:t>
       </w:r>
       <w:r>
-        <w:t>3</w:t>
-      </w:r>
-      <w:r>
-        <w:t xml:space="preserve"> year) – </w:t>
-      </w:r>
-      <w:r>
-        <w:t xml:space="preserve">Subaru of America legacy modernization , </w:t>
-      </w:r>
-      <w:r>
-        <w:t>Various enterprise</w:t>
-      </w:r>
-      <w:r>
-        <w:t xml:space="preserve"> </w:t>
-      </w:r>
-      <w:r>
-        <w:t xml:space="preserve">+ </w:t>
-      </w:r>
-      <w:r>
-        <w:t>single-page</w:t>
-      </w:r>
-      <w:r>
-        <w:t xml:space="preserve"> projects</w:t>
-      </w:r>
-      <w:r>
-        <w:t xml:space="preserve"> at Liberty Fox</w:t>
-      </w:r>
-    </w:p>
-    <w:p>
-      <w:r>
-        <w:t>JavaScript (</w:t>
-      </w:r>
-      <w:r>
-        <w:t>20+</w:t>
-      </w:r>
-      <w:r>
-        <w:t xml:space="preserve"> years) – All professional roles and projects</w:t>
-      </w:r>
-    </w:p>
-    <w:p>
-      <w:r>
-        <w:t>HTML5/CSS3 (15</w:t>
-      </w:r>
-      <w:r>
-        <w:t>+</w:t>
-      </w:r>
-      <w:r>
-        <w:t xml:space="preserve"> years) – All professional roles and projects</w:t>
-      </w:r>
-      <w:r>
-        <w:t xml:space="preserve"> since 201</w:t>
-      </w:r>
-    </w:p>
-    <w:p>
-      <w:r>
-        <w:t>Tailwind CSS (3 years) – ERM, various projects</w:t>
-      </w:r>
-    </w:p>
-    <w:p>
-      <w:r>
-        <w:t>SCSS (10 years) – Multiple professional roles</w:t>
-      </w:r>
-    </w:p>
-    <w:p>
-      <w:pPr>
-        <w:pStyle w:val="Heading2"/>
-      </w:pPr>
-      <w:r>
-        <w:t>Component Libraries &amp; Design Systems</w:t>
-      </w:r>
-    </w:p>
-    <w:p>
-      <w:r>
-        <w:t>Design Systems (2 years) – Subaru of America, AMCS/Dossier Systems</w:t>
-      </w:r>
-    </w:p>
-    <w:p>
-      <w:r>
-        <w:t>Component Libraries (4 years) – Subaru of America, AMCS/Dossier Systems</w:t>
-      </w:r>
-    </w:p>
-    <w:p>
-      <w:r>
-        <w:t>KendoUI – AMCS/Dossier Systems</w:t>
-      </w:r>
-    </w:p>
-    <w:p>
-      <w:r>
-        <w:t>Element UI – AMCS/Dossier Systems</w:t>
-      </w:r>
-    </w:p>
-    <w:p>
-      <w:r>
-        <w:t>OnsenUI – AMCS/Dossier Systems mobile applications</w:t>
-      </w:r>
-    </w:p>
-    <w:p>
-      <w:r>
-        <w:t>MUI (0.3 years) – Recent projects</w:t>
-      </w:r>
-    </w:p>
-    <w:p>
-      <w:r>
-        <w:t>PrimeVue (1 year) – Vue-based projects</w:t>
-      </w:r>
-    </w:p>
-    <w:p>
-      <w:r>
-        <w:t>Vuetify (</w:t>
-      </w:r>
-      <w:r>
-        <w:t>1</w:t>
-      </w:r>
-      <w:r>
-        <w:t xml:space="preserve"> year) – Vue-based projects</w:t>
-      </w:r>
-    </w:p>
-    <w:p>
-      <w:r>
-        <w:t>Quasar (3 years) – BalanceCloud PWA</w:t>
-      </w:r>
-    </w:p>
-    <w:p>
-      <w:pPr>
-        <w:pStyle w:val="Heading2"/>
-      </w:pPr>
-      <w:r>
-        <w:t>Architecture &amp; Development Patterns</w:t>
-      </w:r>
-    </w:p>
-    <w:p>
-      <w:r>
-        <w:t>Micro-Frontends (1 year) – Subaru of America</w:t>
-      </w:r>
-    </w:p>
-    <w:p>
-      <w:r>
-        <w:t>Server-Side Rendering (0.5 years) – AMCS/Dossier Systems</w:t>
-      </w:r>
-    </w:p>
-    <w:p>
-      <w:r>
-        <w:t>Multi-Tenant Architecture – PSMF, enterprise applications</w:t>
-      </w:r>
-    </w:p>
-    <w:p>
-      <w:pPr>
-        <w:ind w:left="360" w:hanging="360"/>
-      </w:pPr>
-      <w:r>
-        <w:t>Progressive Web Applications (PWA) – BalanceCloud</w:t>
-      </w:r>
-    </w:p>
-    <w:p>
-      <w:pPr>
-        <w:ind w:left="360" w:hanging="360"/>
-      </w:pPr>
-      <w:r>
-        <w:t>Low-Code/No-Code Tooling – Subaru of America (custom markdown DSL</w:t>
-      </w:r>
-      <w:r>
-        <w:t>, SNET Dynamic Form</w:t>
-      </w:r>
-      <w:r>
-        <w:t>)</w:t>
-      </w:r>
-    </w:p>
-    <w:p>
-      <w:pPr>
-        <w:ind w:left="360" w:hanging="360"/>
-      </w:pPr>
-      <w:r>
-        <w:t>API Integration (16</w:t>
-      </w:r>
-      <w:r>
-        <w:t>+</w:t>
-      </w:r>
-      <w:r>
-        <w:t xml:space="preserve"> years) – REST, GraphQL across all professional roles</w:t>
-      </w:r>
-    </w:p>
-    <w:p>
-      <w:pPr>
-        <w:ind w:left="360" w:hanging="360"/>
-      </w:pPr>
-      <w:r>
-        <w:t>State Management – Vuex, Pinia, Redux, Context API</w:t>
-      </w:r>
-    </w:p>
-    <w:p>
-      <w:pPr>
-        <w:ind w:left="360" w:hanging="360"/>
-      </w:pPr>
-      <w:r>
-        <w:t>Web Performance Optimization (10 years) – All professional roles</w:t>
-      </w:r>
-    </w:p>
-    <w:p>
-      <w:pPr>
-        <w:ind w:left="360" w:hanging="360"/>
-      </w:pPr>
-      <w:r>
-        <w:t>Build Tools – Vite, Webpack, Rollup</w:t>
-      </w:r>
-    </w:p>
-    <w:p>
-      <w:pPr>
-        <w:pStyle w:val="Heading2"/>
-      </w:pPr>
-      <w:r>
-        <w:t>Testing &amp; Quality Assurance</w:t>
-      </w:r>
-    </w:p>
-    <w:p>
-      <w:pPr>
-        <w:ind w:left="360" w:hanging="360"/>
-      </w:pPr>
-      <w:r>
-        <w:t>Test-Driven Development (4 years) – AMCS/Dossier Systems, current projects</w:t>
-      </w:r>
-    </w:p>
-    <w:p>
-      <w:r>
-        <w:t>Behavior-Driven Development (BDD) – AMCS/Dossier Systems</w:t>
-      </w:r>
-    </w:p>
-    <w:p>
-      <w:r>
-        <w:t xml:space="preserve">Unit Testing (5 years) – Jest, Vue Test Utils, </w:t>
-      </w:r>
-      <w:r>
-        <w:t xml:space="preserve">React Testing Library, </w:t>
-      </w:r>
-      <w:r>
-        <w:t>PHPUnit</w:t>
-      </w:r>
-    </w:p>
-    <w:p>
-      <w:r>
-        <w:t>End-to-End Testing (</w:t>
-      </w:r>
-      <w:r>
-        <w:t>1</w:t>
-      </w:r>
-      <w:r>
-        <w:t xml:space="preserve"> years) – Cypress, Playwright</w:t>
-      </w:r>
-    </w:p>
-    <w:p>
-      <w:r>
-        <w:t>100% Test Coverage Achievement – Subaru of America micro-frontends</w:t>
-      </w:r>
-    </w:p>
-    <w:p>
-      <w:r>
-        <w:t>Web Accessibility (WCAG 2.1 AA, 508 Compliance) – Subaru of America</w:t>
-      </w:r>
-    </w:p>
-    <w:p>
-      <w:r>
-        <w:t>Code Quality Tools – ESLint, Prettier</w:t>
-      </w:r>
-    </w:p>
-    <w:p>
-      <w:pPr>
-        <w:pStyle w:val="Heading2"/>
-      </w:pPr>
-      <w:r>
-        <w:t>Mobile Development</w:t>
-      </w:r>
-    </w:p>
-    <w:p>
-      <w:pPr>
-        <w:ind w:left="360" w:hanging="360"/>
-      </w:pPr>
-      <w:r>
-        <w:t>React Native (0.5 years) – Review the Pew</w:t>
-      </w:r>
-    </w:p>
-    <w:p>
-      <w:r>
-        <w:t>Expo SDK (0.5 years) – Review the Pew</w:t>
-      </w:r>
-    </w:p>
-    <w:p>
-      <w:r>
-        <w:t>Ionic (1 year) – Various mobile projects</w:t>
-      </w:r>
-    </w:p>
-    <w:p>
-      <w:r>
-        <w:t>Capacitor (0.25 years) – Hybrid mobile development</w:t>
-      </w:r>
-    </w:p>
-    <w:p>
-      <w:r>
-        <w:t>Cordova – Legacy mobile applications</w:t>
-      </w:r>
-    </w:p>
-    <w:p>
-      <w:r>
-        <w:t>Hybrid Mobile Frameworks – Northgate Digital Corporation (iOS, Android)</w:t>
-      </w:r>
-    </w:p>
-    <w:p>
-      <w:pPr>
-        <w:pStyle w:val="Heading2"/>
-      </w:pPr>
-      <w:r>
-        <w:t>Backend &amp; Databases</w:t>
-      </w:r>
-    </w:p>
-    <w:p>
-      <w:pPr>
-        <w:ind w:left="360" w:hanging="360"/>
-      </w:pPr>
-      <w:r>
-        <w:t>Laravel (8 years) – Liberty Fox Technologies, BalanceCloud, PSMF, Ghost Letter, Bootstrap Paradox</w:t>
-      </w:r>
-    </w:p>
-    <w:p>
-      <w:r>
-        <w:t>Node.js (7 years) – Various full-stack projects</w:t>
-      </w:r>
-    </w:p>
-    <w:p>
-      <w:r>
-        <w:t>Express (1 year) – API development</w:t>
-      </w:r>
-    </w:p>
-    <w:p>
-      <w:r>
-        <w:t>.NET (1.5 years) – ERM backend integration</w:t>
-      </w:r>
-      <w:r>
-        <w:t>, AMCS/Dossier Systems API development</w:t>
-      </w:r>
-    </w:p>
-    <w:p>
-      <w:r>
-        <w:t>MySQL (10+ years) – All backend projects</w:t>
-      </w:r>
-    </w:p>
-    <w:p>
-      <w:r>
-        <w:t>T-SQL (4 years) – ERM database work</w:t>
-      </w:r>
-      <w:r>
-        <w:t>, AMCS/Dossier Systems</w:t>
-      </w:r>
-    </w:p>
-    <w:p>
-      <w:r>
-        <w:t xml:space="preserve">Entity Framework </w:t>
-      </w:r>
-      <w:r>
-        <w:t xml:space="preserve">(1 year) </w:t>
-      </w:r>
-      <w:r>
-        <w:t>– AMCS/Dossier Systems</w:t>
-      </w:r>
-    </w:p>
-    <w:p>
-      <w:pPr>
-        <w:pStyle w:val="Heading2"/>
-      </w:pPr>
-      <w:r>
-        <w:t>AI-Assisted Development &amp; Modern Workflows</w:t>
-      </w:r>
-    </w:p>
-    <w:p>
-      <w:pPr>
-        <w:ind w:left="360" w:hanging="360"/>
-      </w:pPr>
-      <w:r>
-        <w:t>Claude Code (1 year) – PSMF, Ghost Letter</w:t>
-      </w:r>
-    </w:p>
-    <w:p>
-      <w:pPr>
-        <w:ind w:left="360" w:hanging="360"/>
-      </w:pPr>
-      <w:r>
-        <w:t>GitHub Copilot (1 year) – PSMF, Ghost Letter,</w:t>
-      </w:r>
-      <w:r>
-        <w:t xml:space="preserve"> PR Review</w:t>
-      </w:r>
-    </w:p>
-    <w:p>
-      <w:pPr>
-        <w:ind w:left="360" w:hanging="360"/>
-      </w:pPr>
-      <w:r>
-        <w:t>AI-Assisted Architecture – Rapid prototyping with manual review and production-grade refinement</w:t>
-      </w:r>
-    </w:p>
-    <w:p>
-      <w:pPr>
-        <w:ind w:left="360" w:hanging="360"/>
-      </w:pPr>
-      <w:r>
-        <w:t>Docker – Liberty Fox Technologies, development environment parity</w:t>
-      </w:r>
-    </w:p>
-    <w:p>
-      <w:pPr>
-        <w:pStyle w:val="Heading2"/>
-      </w:pPr>
-      <w:r>
-        <w:t>Enterprise &amp; Agile Methodologies</w:t>
-      </w:r>
-    </w:p>
-    <w:p>
-      <w:pPr>
-        <w:ind w:left="360" w:hanging="360"/>
-      </w:pPr>
-      <w:r>
-        <w:t>Agile/Scrum (15 years) – All professional roles</w:t>
-      </w:r>
-    </w:p>
-    <w:p>
-      <w:pPr>
-        <w:ind w:left="360" w:hanging="360"/>
-      </w:pPr>
-      <w:r>
-        <w:t>Team Leadership – AMCS/Dossier Systems UI development team</w:t>
-      </w:r>
-    </w:p>
-    <w:p>
-      <w:pPr>
-        <w:ind w:left="360" w:hanging="360"/>
-      </w:pPr>
-      <w:r>
-        <w:t>Mentoring – Junior developer guidance and code review</w:t>
-      </w:r>
-    </w:p>
-    <w:p>
-      <w:pPr>
-        <w:ind w:left="360" w:hanging="360"/>
-      </w:pPr>
-      <w:r>
-        <w:t>Cross-Functional Collaboration – Backend integration, API design, technical specifications</w:t>
-      </w:r>
-    </w:p>
-    <w:p>
-      <w:pPr>
-        <w:ind w:left="360" w:hanging="360"/>
-      </w:pPr>
-      <w:r>
-        <w:t>Weekly Production Deployments – AMCS/Dossier Systems</w:t>
-      </w:r>
-    </w:p>
-    <w:p>
-      <w:pPr>
-        <w:ind w:left="360" w:hanging="360"/>
-      </w:pPr>
-      <w:r>
-        <w:t>CI/CD Optimization – Subaru of America (50% runtime improvement)</w:t>
-      </w:r>
-    </w:p>
-    <w:p>
-      <w:pPr>
-        <w:pStyle w:val="Heading2"/>
-      </w:pPr>
-      <w:r>
-        <w:t>Security &amp; Authentication</w:t>
-      </w:r>
-    </w:p>
-    <w:p>
-      <w:pPr>
-        <w:ind w:left="360" w:hanging="360"/>
-      </w:pPr>
-      <w:r>
-        <w:t>Two-Factor Authentication (2FA) – Bootstrap Paradox AuthKit package</w:t>
-      </w:r>
-    </w:p>
-    <w:p>
-      <w:pPr>
-        <w:ind w:left="360" w:hanging="360"/>
-      </w:pPr>
-      <w:r>
-        <w:t>Passkey Authentication – Bootstrap Paradox AuthKit package</w:t>
-      </w:r>
-    </w:p>
-    <w:p>
-      <w:pPr>
-        <w:ind w:left="360" w:hanging="360"/>
-      </w:pPr>
-      <w:r>
-        <w:t>Role-Based Access Control (RBAC) – Bootstrap Paradox AuthKit package</w:t>
-      </w:r>
-    </w:p>
-    <w:p>
-      <w:pPr>
-        <w:ind w:left="360" w:hanging="360"/>
-      </w:pPr>
-      <w:r>
-        <w:t>SSO Architecture – Liberty Fox Technologies</w:t>
-      </w:r>
-    </w:p>
-    <w:p>
-      <w:pPr>
-        <w:ind w:left="360" w:hanging="360"/>
-      </w:pPr>
-      <w:r>
-        <w:t>Digital Rights Management (DRM) – PlayReady, Widevine, FairPlay Streaming</w:t>
-      </w:r>
-    </w:p>
-    <w:p>
-      <w:pPr>
-        <w:ind w:left="360" w:hanging="360"/>
-      </w:pPr>
-      <w:r>
-        <w:t>Security Monitoring – fail2ban, custom honeypot integration</w:t>
-      </w:r>
-    </w:p>
-    <w:p>
-      <w:pPr>
-        <w:ind w:left="360" w:hanging="360"/>
-      </w:pPr>
-      <w:r>
-        <w:t>Payment Gateway Integration – PayPal API, Stripe API</w:t>
-      </w:r>
-    </w:p>
-    <w:p>
-      <w:pPr>
-        <w:pStyle w:val="Heading2"/>
-      </w:pPr>
-      <w:r>
-        <w:t>Specialized Integrations &amp; Technologies</w:t>
-      </w:r>
-    </w:p>
-    <w:p>
-      <w:pPr>
-        <w:ind w:left="360" w:hanging="360"/>
-      </w:pPr>
-      <w:r>
-        <w:t>Content Management Systems – WordPress, Drupal</w:t>
-      </w:r>
-    </w:p>
-    <w:p>
-      <w:pPr>
-        <w:ind w:left="360" w:hanging="360"/>
-      </w:pPr>
-      <w:r>
-        <w:t>Analytics &amp; Monitoring – Chart.js visualizations, custom analytics solutions</w:t>
-      </w:r>
-    </w:p>
-    <w:p>
-      <w:pPr>
-        <w:ind w:left="360" w:hanging="360"/>
-      </w:pPr>
-      <w:r>
-        <w:t>GPS Integration – Northgate Digital Corporation mobile applications</w:t>
-      </w:r>
-    </w:p>
-    <w:p>
-      <w:pPr>
-        <w:ind w:left="360" w:hanging="360"/>
-      </w:pPr>
-      <w:r>
-        <w:t>Real-Time Communication – Chat systems, geofencing</w:t>
-      </w:r>
-    </w:p>
-    <w:p>
-      <w:pPr>
-        <w:ind w:left="360" w:hanging="360"/>
-      </w:pPr>
-      <w:r>
-        <w:t>Web Scraping &amp; Data Integration – ERM multi-source data processing</w:t>
-      </w:r>
-    </w:p>
-    <w:p>
-      <w:pPr>
-        <w:ind w:left="360" w:hanging="360"/>
-      </w:pPr>
-      <w:r>
-        <w:t>Document Processing – Word format conversion, HTML generation</w:t>
-      </w:r>
-    </w:p>
-    <w:p>
-      <w:pPr>
-        <w:ind w:left="360" w:hanging="360"/>
-      </w:pPr>
-      <w:r>
-        <w:t>Video Streaming Platforms – iOS, Android, Android TV, Apple TV</w:t>
-      </w:r>
-    </w:p>
-    <w:p>
-      <w:pPr>
-        <w:pStyle w:val="Heading2"/>
-      </w:pPr>
-      <w:r>
-        <w:t>Infrastructure &amp; Dev</w:t>
-      </w:r>
-      <w:r>
-        <w:t xml:space="preserve"> O</w:t>
-      </w:r>
-      <w:r>
-        <w:t>ps</w:t>
-      </w:r>
-    </w:p>
-    <w:p>
-      <w:pPr>
-        <w:ind w:left="360" w:hanging="360"/>
-      </w:pPr>
-      <w:r>
-        <w:t>Linux Server Administration – Review the Pew</w:t>
-      </w:r>
-    </w:p>
-    <w:p>
-      <w:pPr>
-        <w:ind w:left="360" w:hanging="360"/>
-      </w:pPr>
-      <w:r>
-        <w:t>Web Server Configuration – Lighttpd, Apache</w:t>
-      </w:r>
-      <w:r>
-        <w:t>, nginx</w:t>
-      </w:r>
-    </w:p>
-    <w:p>
-      <w:pPr>
-        <w:ind w:left="360" w:hanging="360"/>
-      </w:pPr>
-      <w:r>
-        <w:t>Version Control – Git (12 years)</w:t>
-      </w:r>
-    </w:p>
-    <w:p>
-      <w:pPr>
-        <w:ind w:left="360" w:hanging="360"/>
-      </w:pPr>
-      <w:r>
-        <w:t>Development Environment Management – Docker, local/production parity</w:t>
+        <w:t>{years}</w:t>
+      </w:r>
+      <w:r>
+        <w:t xml:space="preserve"> years)</w:t>
+      </w:r>
+      <w:r>
+        <w:t>{/years}</w:t>
+      </w:r>
+      <w:r>
+        <w:t xml:space="preserve"> – {description}</w:t>
+      </w:r>
+    </w:p>
+    <w:p>
+      <w:r>
+        <w:t>{/skills}</w:t>
+      </w:r>
+    </w:p>
+    <w:p>
+      <w:r>
+        <w:t>{/secondary}</w:t>
+      </w:r>
+    </w:p>
+    <w:p/>
+    <w:p>
+      <w:r>
+        <w:t>{/</w:t>
+      </w:r>
+      <w:proofErr w:type="spellStart"/>
+      <w:r>
+        <w:t>technicalProfile</w:t>
+      </w:r>
+      <w:proofErr w:type="spellEnd"/>
+      <w:r>
+        <w:t>}</w:t>
       </w:r>
     </w:p>
     <w:sectPr>
@@ -2826,7 +1915,7 @@
   <w:style w:type="paragraph" w:default="1" w:styleId="Normal">
     <w:name w:val="Normal"/>
     <w:qFormat/>
-    <w:rsid w:val="006A0B2B"/>
+    <w:rsid w:val="00752C4A"/>
     <w:rPr>
       <w:rFonts w:ascii="Corbel" w:hAnsi="Corbel"/>
       <w:sz w:val="20"/>
@@ -3171,6 +2260,32 @@
     <w:rPr>
       <w:color w:val="96607D" w:themeColor="followedHyperlink"/>
       <w:u w:val="single"/>
+    </w:rPr>
+  </w:style>
+  <w:style w:type="paragraph" w:styleId="HTMLPreformatted">
+    <w:name w:val="HTML Preformatted"/>
+    <w:basedOn w:val="Normal"/>
+    <w:link w:val="HTMLPreformattedChar"/>
+    <w:uiPriority w:val="99"/>
+    <w:semiHidden/>
+    <w:unhideWhenUsed/>
+    <w:rsid w:val="00D73D0F"/>
+    <w:rPr>
+      <w:rFonts w:ascii="Consolas" w:hAnsi="Consolas"/>
+      <w:szCs w:val="20"/>
+    </w:rPr>
+  </w:style>
+  <w:style w:type="character" w:customStyle="1" w:styleId="HTMLPreformattedChar">
+    <w:name w:val="HTML Preformatted Char"/>
+    <w:basedOn w:val="DefaultParagraphFont"/>
+    <w:link w:val="HTMLPreformatted"/>
+    <w:uiPriority w:val="99"/>
+    <w:semiHidden/>
+    <w:rsid w:val="00D73D0F"/>
+    <w:rPr>
+      <w:rFonts w:ascii="Consolas" w:hAnsi="Consolas"/>
+      <w:sz w:val="20"/>
+      <w:szCs w:val="20"/>
     </w:rPr>
   </w:style>
 </w:styles>

</xml_diff>

<commit_message>
Docx and PDF generation
</commit_message>
<xml_diff>
--- a/resources/resume/2026 resume template.docx
+++ b/resources/resume/2026 resume template.docx
@@ -2,7 +2,9 @@
 <file path=word/document.xml><?xml version="1.0" encoding="utf-8"?>
 <w:document xmlns:wpc="http://schemas.microsoft.com/office/word/2010/wordprocessingCanvas" xmlns:cx="http://schemas.microsoft.com/office/drawing/2014/chartex" xmlns:cx1="http://schemas.microsoft.com/office/drawing/2015/9/8/chartex" xmlns:cx2="http://schemas.microsoft.com/office/drawing/2015/10/21/chartex" xmlns:cx3="http://schemas.microsoft.com/office/drawing/2016/5/9/chartex" xmlns:cx4="http://schemas.microsoft.com/office/drawing/2016/5/10/chartex" xmlns:cx5="http://schemas.microsoft.com/office/drawing/2016/5/11/chartex" xmlns:cx6="http://schemas.microsoft.com/office/drawing/2016/5/12/chartex" xmlns:cx7="http://schemas.microsoft.com/office/drawing/2016/5/13/chartex" xmlns:cx8="http://schemas.microsoft.com/office/drawing/2016/5/14/chartex" xmlns:mc="http://schemas.openxmlformats.org/markup-compatibility/2006" xmlns:aink="http://schemas.microsoft.com/office/drawing/2016/ink" xmlns:am3d="http://schemas.microsoft.com/office/drawing/2017/model3d" xmlns:o="urn:schemas-microsoft-com:office:office" xmlns:oel="http://schemas.microsoft.com/office/2019/extlst" xmlns:r="http://schemas.openxmlformats.org/officeDocument/2006/relationships" xmlns:m="http://schemas.openxmlformats.org/officeDocument/2006/math" xmlns:v="urn:schemas-microsoft-com:vml" xmlns:wp14="http://schemas.microsoft.com/office/word/2010/wordprocessingDrawing" xmlns:wp="http://schemas.openxmlformats.org/drawingml/2006/wordprocessingDrawing" xmlns:w10="urn:schemas-microsoft-com:office:word" xmlns:w="http://schemas.openxmlformats.org/wordprocessingml/2006/main" xmlns:w14="http://schemas.microsoft.com/office/word/2010/wordml" xmlns:w15="http://schemas.microsoft.com/office/word/2012/wordml" xmlns:w16cex="http://schemas.microsoft.com/office/word/2018/wordml/cex" xmlns:w16cid="http://schemas.microsoft.com/office/word/2016/wordml/cid" xmlns:w16="http://schemas.microsoft.com/office/word/2018/wordml" xmlns:w16du="http://schemas.microsoft.com/office/word/2023/wordml/word16du" xmlns:w16sdtdh="http://schemas.microsoft.com/office/word/2020/wordml/sdtdatahash" xmlns:w16sdtfl="http://schemas.microsoft.com/office/word/2024/wordml/sdtformatlock" xmlns:w16se="http://schemas.microsoft.com/office/word/2015/wordml/symex" xmlns:wpg="http://schemas.microsoft.com/office/word/2010/wordprocessingGroup" xmlns:wpi="http://schemas.microsoft.com/office/word/2010/wordprocessingInk" xmlns:wne="http://schemas.microsoft.com/office/word/2006/wordml" xmlns:wps="http://schemas.microsoft.com/office/word/2010/wordprocessingShape" mc:Ignorable="w14 w15 w16se w16cid w16 w16cex w16sdtdh w16sdtfl w16du wp14">
   <w:body>
-    <w:bookmarkStart w:id="0" w:name="_Hlk211971945"/>
+    <w:p>
+      <w:bookmarkStart w:id="0" w:name="_Hlk211971945"/>
+    </w:p>
     <w:p>
       <w:pPr>
         <w:pStyle w:val="Heading1"/>
@@ -78,13 +80,13 @@
                               <w:pStyle w:val="Title"/>
                               <w:rPr>
                                 <w:caps/>
-                                <w:color w:val="auto"/>
+                                <w:color w:val="FFFFFF" w:themeColor="background1"/>
                               </w:rPr>
                             </w:pPr>
                             <w:r>
                               <w:rPr>
                                 <w:caps/>
-                                <w:color w:val="auto"/>
+                                <w:color w:val="FFFFFF" w:themeColor="background1"/>
                               </w:rPr>
                               <w:t>Jason Vertucio</w:t>
                             </w:r>
@@ -94,11 +96,13 @@
                               <w:spacing w:after="240"/>
                               <w:jc w:val="center"/>
                               <w:rPr>
+                                <w:color w:val="FFFFFF" w:themeColor="background1"/>
                                 <w:sz w:val="22"/>
                               </w:rPr>
                             </w:pPr>
                             <w:r>
                               <w:rPr>
+                                <w:color w:val="FFFFFF" w:themeColor="background1"/>
                                 <w:sz w:val="22"/>
                               </w:rPr>
                               <w:t xml:space="preserve">Senior Front-End Engineer • </w:t>
@@ -107,7 +111,7 @@
                               <w:r>
                                 <w:rPr>
                                   <w:rStyle w:val="Hyperlink"/>
-                                  <w:color w:val="auto"/>
+                                  <w:color w:val="FFFFFF" w:themeColor="background1"/>
                                   <w:sz w:val="22"/>
                                   <w:u w:val="none"/>
                                 </w:rPr>
@@ -116,6 +120,7 @@
                             </w:hyperlink>
                             <w:r>
                               <w:rPr>
+                                <w:color w:val="FFFFFF" w:themeColor="background1"/>
                                 <w:sz w:val="22"/>
                               </w:rPr>
                               <w:t xml:space="preserve"> • </w:t>
@@ -124,7 +129,7 @@
                               <w:r>
                                 <w:rPr>
                                   <w:rStyle w:val="Hyperlink"/>
-                                  <w:color w:val="auto"/>
+                                  <w:color w:val="FFFFFF" w:themeColor="background1"/>
                                   <w:sz w:val="22"/>
                                   <w:u w:val="none"/>
                                 </w:rPr>
@@ -133,6 +138,7 @@
                             </w:hyperlink>
                             <w:r>
                               <w:rPr>
+                                <w:color w:val="FFFFFF" w:themeColor="background1"/>
                                 <w:sz w:val="22"/>
                               </w:rPr>
                               <w:t xml:space="preserve"> • </w:t>
@@ -141,7 +147,7 @@
                               <w:r>
                                 <w:rPr>
                                   <w:rStyle w:val="Hyperlink"/>
-                                  <w:color w:val="auto"/>
+                                  <w:color w:val="FFFFFF" w:themeColor="background1"/>
                                   <w:sz w:val="22"/>
                                   <w:u w:val="none"/>
                                 </w:rPr>
@@ -151,7 +157,7 @@
                               <w:r>
                                 <w:rPr>
                                   <w:rStyle w:val="Hyperlink"/>
-                                  <w:color w:val="auto"/>
+                                  <w:color w:val="FFFFFF" w:themeColor="background1"/>
                                   <w:sz w:val="22"/>
                                   <w:u w:val="none"/>
                                 </w:rPr>
@@ -190,13 +196,13 @@
                         <w:pStyle w:val="Title"/>
                         <w:rPr>
                           <w:caps/>
-                          <w:color w:val="auto"/>
+                          <w:color w:val="FFFFFF" w:themeColor="background1"/>
                         </w:rPr>
                       </w:pPr>
                       <w:r>
                         <w:rPr>
                           <w:caps/>
-                          <w:color w:val="auto"/>
+                          <w:color w:val="FFFFFF" w:themeColor="background1"/>
                         </w:rPr>
                         <w:t>Jason Vertucio</w:t>
                       </w:r>
@@ -206,11 +212,13 @@
                         <w:spacing w:after="240"/>
                         <w:jc w:val="center"/>
                         <w:rPr>
+                          <w:color w:val="FFFFFF" w:themeColor="background1"/>
                           <w:sz w:val="22"/>
                         </w:rPr>
                       </w:pPr>
                       <w:r>
                         <w:rPr>
+                          <w:color w:val="FFFFFF" w:themeColor="background1"/>
                           <w:sz w:val="22"/>
                         </w:rPr>
                         <w:t xml:space="preserve">Senior Front-End Engineer • </w:t>
@@ -219,7 +227,7 @@
                         <w:r>
                           <w:rPr>
                             <w:rStyle w:val="Hyperlink"/>
-                            <w:color w:val="auto"/>
+                            <w:color w:val="FFFFFF" w:themeColor="background1"/>
                             <w:sz w:val="22"/>
                             <w:u w:val="none"/>
                           </w:rPr>
@@ -228,6 +236,7 @@
                       </w:hyperlink>
                       <w:r>
                         <w:rPr>
+                          <w:color w:val="FFFFFF" w:themeColor="background1"/>
                           <w:sz w:val="22"/>
                         </w:rPr>
                         <w:t xml:space="preserve"> • </w:t>
@@ -236,7 +245,7 @@
                         <w:r>
                           <w:rPr>
                             <w:rStyle w:val="Hyperlink"/>
-                            <w:color w:val="auto"/>
+                            <w:color w:val="FFFFFF" w:themeColor="background1"/>
                             <w:sz w:val="22"/>
                             <w:u w:val="none"/>
                           </w:rPr>
@@ -245,6 +254,7 @@
                       </w:hyperlink>
                       <w:r>
                         <w:rPr>
+                          <w:color w:val="FFFFFF" w:themeColor="background1"/>
                           <w:sz w:val="22"/>
                         </w:rPr>
                         <w:t xml:space="preserve"> • </w:t>
@@ -253,7 +263,7 @@
                         <w:r>
                           <w:rPr>
                             <w:rStyle w:val="Hyperlink"/>
-                            <w:color w:val="auto"/>
+                            <w:color w:val="FFFFFF" w:themeColor="background1"/>
                             <w:sz w:val="22"/>
                             <w:u w:val="none"/>
                           </w:rPr>
@@ -263,7 +273,7 @@
                         <w:r>
                           <w:rPr>
                             <w:rStyle w:val="Hyperlink"/>
-                            <w:color w:val="auto"/>
+                            <w:color w:val="FFFFFF" w:themeColor="background1"/>
                             <w:sz w:val="22"/>
                             <w:u w:val="none"/>
                           </w:rPr>

</xml_diff>

<commit_message>
fix pdf generation in production
</commit_message>
<xml_diff>
--- a/resources/resume/2026 resume template.docx
+++ b/resources/resume/2026 resume template.docx
@@ -2,9 +2,7 @@
 <file path=word/document.xml><?xml version="1.0" encoding="utf-8"?>
 <w:document xmlns:wpc="http://schemas.microsoft.com/office/word/2010/wordprocessingCanvas" xmlns:cx="http://schemas.microsoft.com/office/drawing/2014/chartex" xmlns:cx1="http://schemas.microsoft.com/office/drawing/2015/9/8/chartex" xmlns:cx2="http://schemas.microsoft.com/office/drawing/2015/10/21/chartex" xmlns:cx3="http://schemas.microsoft.com/office/drawing/2016/5/9/chartex" xmlns:cx4="http://schemas.microsoft.com/office/drawing/2016/5/10/chartex" xmlns:cx5="http://schemas.microsoft.com/office/drawing/2016/5/11/chartex" xmlns:cx6="http://schemas.microsoft.com/office/drawing/2016/5/12/chartex" xmlns:cx7="http://schemas.microsoft.com/office/drawing/2016/5/13/chartex" xmlns:cx8="http://schemas.microsoft.com/office/drawing/2016/5/14/chartex" xmlns:mc="http://schemas.openxmlformats.org/markup-compatibility/2006" xmlns:aink="http://schemas.microsoft.com/office/drawing/2016/ink" xmlns:am3d="http://schemas.microsoft.com/office/drawing/2017/model3d" xmlns:o="urn:schemas-microsoft-com:office:office" xmlns:oel="http://schemas.microsoft.com/office/2019/extlst" xmlns:r="http://schemas.openxmlformats.org/officeDocument/2006/relationships" xmlns:m="http://schemas.openxmlformats.org/officeDocument/2006/math" xmlns:v="urn:schemas-microsoft-com:vml" xmlns:wp14="http://schemas.microsoft.com/office/word/2010/wordprocessingDrawing" xmlns:wp="http://schemas.openxmlformats.org/drawingml/2006/wordprocessingDrawing" xmlns:w10="urn:schemas-microsoft-com:office:word" xmlns:w="http://schemas.openxmlformats.org/wordprocessingml/2006/main" xmlns:w14="http://schemas.microsoft.com/office/word/2010/wordml" xmlns:w15="http://schemas.microsoft.com/office/word/2012/wordml" xmlns:w16cex="http://schemas.microsoft.com/office/word/2018/wordml/cex" xmlns:w16cid="http://schemas.microsoft.com/office/word/2016/wordml/cid" xmlns:w16="http://schemas.microsoft.com/office/word/2018/wordml" xmlns:w16du="http://schemas.microsoft.com/office/word/2023/wordml/word16du" xmlns:w16sdtdh="http://schemas.microsoft.com/office/word/2020/wordml/sdtdatahash" xmlns:w16sdtfl="http://schemas.microsoft.com/office/word/2024/wordml/sdtformatlock" xmlns:w16se="http://schemas.microsoft.com/office/word/2015/wordml/symex" xmlns:wpg="http://schemas.microsoft.com/office/word/2010/wordprocessingGroup" xmlns:wpi="http://schemas.microsoft.com/office/word/2010/wordprocessingInk" xmlns:wne="http://schemas.microsoft.com/office/word/2006/wordml" xmlns:wps="http://schemas.microsoft.com/office/word/2010/wordprocessingShape" mc:Ignorable="w14 w15 w16se w16cid w16 w16cex w16sdtdh w16sdtfl w16du wp14">
   <w:body>
-    <w:p>
-      <w:bookmarkStart w:id="0" w:name="_Hlk211971945"/>
-    </w:p>
+    <w:bookmarkStart w:id="0" w:name="_Hlk211971945"/>
     <w:p>
       <w:pPr>
         <w:pStyle w:val="Heading1"/>
@@ -80,13 +78,13 @@
                               <w:pStyle w:val="Title"/>
                               <w:rPr>
                                 <w:caps/>
-                                <w:color w:val="FFFFFF" w:themeColor="background1"/>
+                                <w:color w:val="auto"/>
                               </w:rPr>
                             </w:pPr>
                             <w:r>
                               <w:rPr>
                                 <w:caps/>
-                                <w:color w:val="FFFFFF" w:themeColor="background1"/>
+                                <w:color w:val="auto"/>
                               </w:rPr>
                               <w:t>Jason Vertucio</w:t>
                             </w:r>
@@ -96,13 +94,11 @@
                               <w:spacing w:after="240"/>
                               <w:jc w:val="center"/>
                               <w:rPr>
-                                <w:color w:val="FFFFFF" w:themeColor="background1"/>
                                 <w:sz w:val="22"/>
                               </w:rPr>
                             </w:pPr>
                             <w:r>
                               <w:rPr>
-                                <w:color w:val="FFFFFF" w:themeColor="background1"/>
                                 <w:sz w:val="22"/>
                               </w:rPr>
                               <w:t xml:space="preserve">Senior Front-End Engineer • </w:t>
@@ -111,7 +107,7 @@
                               <w:r>
                                 <w:rPr>
                                   <w:rStyle w:val="Hyperlink"/>
-                                  <w:color w:val="FFFFFF" w:themeColor="background1"/>
+                                  <w:color w:val="auto"/>
                                   <w:sz w:val="22"/>
                                   <w:u w:val="none"/>
                                 </w:rPr>
@@ -120,7 +116,6 @@
                             </w:hyperlink>
                             <w:r>
                               <w:rPr>
-                                <w:color w:val="FFFFFF" w:themeColor="background1"/>
                                 <w:sz w:val="22"/>
                               </w:rPr>
                               <w:t xml:space="preserve"> • </w:t>
@@ -129,7 +124,7 @@
                               <w:r>
                                 <w:rPr>
                                   <w:rStyle w:val="Hyperlink"/>
-                                  <w:color w:val="FFFFFF" w:themeColor="background1"/>
+                                  <w:color w:val="auto"/>
                                   <w:sz w:val="22"/>
                                   <w:u w:val="none"/>
                                 </w:rPr>
@@ -138,7 +133,6 @@
                             </w:hyperlink>
                             <w:r>
                               <w:rPr>
-                                <w:color w:val="FFFFFF" w:themeColor="background1"/>
                                 <w:sz w:val="22"/>
                               </w:rPr>
                               <w:t xml:space="preserve"> • </w:t>
@@ -147,7 +141,7 @@
                               <w:r>
                                 <w:rPr>
                                   <w:rStyle w:val="Hyperlink"/>
-                                  <w:color w:val="FFFFFF" w:themeColor="background1"/>
+                                  <w:color w:val="auto"/>
                                   <w:sz w:val="22"/>
                                   <w:u w:val="none"/>
                                 </w:rPr>
@@ -157,7 +151,7 @@
                               <w:r>
                                 <w:rPr>
                                   <w:rStyle w:val="Hyperlink"/>
-                                  <w:color w:val="FFFFFF" w:themeColor="background1"/>
+                                  <w:color w:val="auto"/>
                                   <w:sz w:val="22"/>
                                   <w:u w:val="none"/>
                                 </w:rPr>
@@ -196,13 +190,13 @@
                         <w:pStyle w:val="Title"/>
                         <w:rPr>
                           <w:caps/>
-                          <w:color w:val="FFFFFF" w:themeColor="background1"/>
+                          <w:color w:val="auto"/>
                         </w:rPr>
                       </w:pPr>
                       <w:r>
                         <w:rPr>
                           <w:caps/>
-                          <w:color w:val="FFFFFF" w:themeColor="background1"/>
+                          <w:color w:val="auto"/>
                         </w:rPr>
                         <w:t>Jason Vertucio</w:t>
                       </w:r>
@@ -212,13 +206,11 @@
                         <w:spacing w:after="240"/>
                         <w:jc w:val="center"/>
                         <w:rPr>
-                          <w:color w:val="FFFFFF" w:themeColor="background1"/>
                           <w:sz w:val="22"/>
                         </w:rPr>
                       </w:pPr>
                       <w:r>
                         <w:rPr>
-                          <w:color w:val="FFFFFF" w:themeColor="background1"/>
                           <w:sz w:val="22"/>
                         </w:rPr>
                         <w:t xml:space="preserve">Senior Front-End Engineer • </w:t>
@@ -227,7 +219,7 @@
                         <w:r>
                           <w:rPr>
                             <w:rStyle w:val="Hyperlink"/>
-                            <w:color w:val="FFFFFF" w:themeColor="background1"/>
+                            <w:color w:val="auto"/>
                             <w:sz w:val="22"/>
                             <w:u w:val="none"/>
                           </w:rPr>
@@ -236,7 +228,6 @@
                       </w:hyperlink>
                       <w:r>
                         <w:rPr>
-                          <w:color w:val="FFFFFF" w:themeColor="background1"/>
                           <w:sz w:val="22"/>
                         </w:rPr>
                         <w:t xml:space="preserve"> • </w:t>
@@ -245,7 +236,7 @@
                         <w:r>
                           <w:rPr>
                             <w:rStyle w:val="Hyperlink"/>
-                            <w:color w:val="FFFFFF" w:themeColor="background1"/>
+                            <w:color w:val="auto"/>
                             <w:sz w:val="22"/>
                             <w:u w:val="none"/>
                           </w:rPr>
@@ -254,7 +245,6 @@
                       </w:hyperlink>
                       <w:r>
                         <w:rPr>
-                          <w:color w:val="FFFFFF" w:themeColor="background1"/>
                           <w:sz w:val="22"/>
                         </w:rPr>
                         <w:t xml:space="preserve"> • </w:t>
@@ -263,7 +253,7 @@
                         <w:r>
                           <w:rPr>
                             <w:rStyle w:val="Hyperlink"/>
-                            <w:color w:val="FFFFFF" w:themeColor="background1"/>
+                            <w:color w:val="auto"/>
                             <w:sz w:val="22"/>
                             <w:u w:val="none"/>
                           </w:rPr>
@@ -273,7 +263,7 @@
                         <w:r>
                           <w:rPr>
                             <w:rStyle w:val="Hyperlink"/>
-                            <w:color w:val="FFFFFF" w:themeColor="background1"/>
+                            <w:color w:val="auto"/>
                             <w:sz w:val="22"/>
                             <w:u w:val="none"/>
                           </w:rPr>

</xml_diff>

<commit_message>
Remove Technical Profile pages from resume and editor
</commit_message>
<xml_diff>
--- a/resources/resume/2026 resume template.docx
+++ b/resources/resume/2026 resume template.docx
@@ -731,123 +731,6 @@
           <w:szCs w:val="26"/>
         </w:rPr>
       </w:pPr>
-      <w:r>
-        <w:br w:type="page"/>
-      </w:r>
-    </w:p>
-    <w:p>
-      <w:pPr>
-        <w:pStyle w:val="Heading1"/>
-      </w:pPr>
-      <w:r>
-        <w:t>TECHNICAL PROFILE</w:t>
-      </w:r>
-    </w:p>
-    <w:p>
-      <w:r>
-        <w:t>{#technicalProfile}</w:t>
-      </w:r>
-    </w:p>
-    <w:p>
-      <w:pPr>
-        <w:pStyle w:val="Heading2"/>
-      </w:pPr>
-      <w:r>
-        <w:t>{</w:t>
-      </w:r>
-      <w:proofErr w:type="spellStart"/>
-      <w:r>
-        <w:t>main.</w:t>
-      </w:r>
-      <w:r>
-        <w:t>category</w:t>
-      </w:r>
-      <w:proofErr w:type="spellEnd"/>
-      <w:r>
-        <w:t>}</w:t>
-      </w:r>
-    </w:p>
-    <w:p>
-      <w:r>
-        <w:t>{</w:t>
-      </w:r>
-      <w:proofErr w:type="spellStart"/>
-      <w:r>
-        <w:t>main.</w:t>
-      </w:r>
-      <w:r>
-        <w:t>listJoined</w:t>
-      </w:r>
-      <w:proofErr w:type="spellEnd"/>
-      <w:r>
-        <w:t>}</w:t>
-      </w:r>
-    </w:p>
-    <w:p/>
-    <w:p>
-      <w:r>
-        <w:t>{#secondary}</w:t>
-      </w:r>
-    </w:p>
-    <w:p>
-      <w:pPr>
-        <w:pStyle w:val="Heading2"/>
-      </w:pPr>
-      <w:r>
-        <w:t>{category}</w:t>
-      </w:r>
-    </w:p>
-    <w:p>
-      <w:r>
-        <w:t>{#skills}</w:t>
-      </w:r>
-    </w:p>
-    <w:p>
-      <w:r>
-        <w:t xml:space="preserve">{skill} </w:t>
-      </w:r>
-      <w:r>
-        <w:t>{#years}</w:t>
-      </w:r>
-      <w:r>
-        <w:t>(</w:t>
-      </w:r>
-      <w:r>
-        <w:t>{years}</w:t>
-      </w:r>
-      <w:r>
-        <w:t xml:space="preserve"> years)</w:t>
-      </w:r>
-      <w:r>
-        <w:t>{/years}</w:t>
-      </w:r>
-      <w:r>
-        <w:t xml:space="preserve"> – {description}</w:t>
-      </w:r>
-    </w:p>
-    <w:p>
-      <w:r>
-        <w:t>{/skills}</w:t>
-      </w:r>
-    </w:p>
-    <w:p>
-      <w:r>
-        <w:t>{/secondary}</w:t>
-      </w:r>
-    </w:p>
-    <w:p/>
-    <w:p>
-      <w:r>
-        <w:t>{/</w:t>
-      </w:r>
-      <w:proofErr w:type="spellStart"/>
-      <w:r>
-        <w:t>technicalProfile</w:t>
-      </w:r>
-      <w:proofErr w:type="spellEnd"/>
-      <w:r>
-        <w:t>}</w:t>
-      </w:r>
     </w:p>
     <w:sectPr>
       <w:type w:val="continuous"/>

</xml_diff>

<commit_message>
chore: update 2026 resume template
</commit_message>
<xml_diff>
--- a/resources/resume/2026 resume template.docx
+++ b/resources/resume/2026 resume template.docx
@@ -294,16 +294,6 @@
       </w:r>
     </w:p>
     <w:p>
-      <w:pPr>
-        <w:spacing w:after="120"/>
-        <w:sectPr>
-          <w:type w:val="continuous"/>
-          <w:pgSz w:w="11906" w:h="16838"/>
-          <w:pgMar w:top="948" w:right="720" w:bottom="540" w:left="720" w:header="708" w:footer="708" w:gutter="0"/>
-          <w:cols w:space="720"/>
-          <w:docGrid w:linePitch="360"/>
-        </w:sectPr>
-      </w:pPr>
       <w:r>
         <w:t>{summary}</w:t>
       </w:r>
@@ -311,13 +301,6 @@
     <w:p>
       <w:pPr>
         <w:pStyle w:val="Heading1"/>
-        <w:sectPr>
-          <w:type w:val="continuous"/>
-          <w:pgSz w:w="11906" w:h="16838"/>
-          <w:pgMar w:top="1440" w:right="720" w:bottom="540" w:left="720" w:header="708" w:footer="708" w:gutter="0"/>
-          <w:cols w:space="720"/>
-          <w:docGrid w:linePitch="360"/>
-        </w:sectPr>
       </w:pPr>
       <w:r>
         <w:t>TECHNICAL SKILLS</w:t>
@@ -340,11 +323,12 @@
           <w:headerReference w:type="default" r:id="rId14"/>
           <w:type w:val="continuous"/>
           <w:pgSz w:w="11906" w:h="16838"/>
-          <w:pgMar w:top="900" w:right="720" w:bottom="540" w:left="720" w:header="708" w:footer="708" w:gutter="0"/>
+          <w:pgMar w:top="1034" w:right="720" w:bottom="540" w:left="720" w:header="708" w:footer="708" w:gutter="0"/>
           <w:cols w:space="720"/>
           <w:docGrid w:linePitch="360"/>
         </w:sectPr>
       </w:pPr>
+      <w:proofErr w:type="gramStart"/>
       <w:r>
         <w:t>{</w:t>
       </w:r>
@@ -354,7 +338,11 @@
       </w:r>
       <w:proofErr w:type="spellEnd"/>
       <w:r>
-        <w:t>}{/top}</w:t>
+        <w:t>}{/</w:t>
+      </w:r>
+      <w:proofErr w:type="gramEnd"/>
+      <w:r>
+        <w:t>top}</w:t>
       </w:r>
     </w:p>
     <w:p>
@@ -393,36 +381,34 @@
         <w:sectPr>
           <w:type w:val="continuous"/>
           <w:pgSz w:w="11906" w:h="16838"/>
-          <w:pgMar w:top="900" w:right="720" w:bottom="540" w:left="720" w:header="708" w:footer="708" w:gutter="0"/>
+          <w:pgMar w:top="1034" w:right="720" w:bottom="540" w:left="720" w:header="708" w:footer="708" w:gutter="0"/>
           <w:cols w:num="2" w:space="720"/>
           <w:docGrid w:linePitch="360"/>
         </w:sectPr>
       </w:pPr>
-    </w:p>
-    <w:p>
       <w:r>
         <w:t>{/skills}</w:t>
       </w:r>
     </w:p>
     <w:p>
       <w:pPr>
-        <w:pStyle w:val="Heading1"/>
-      </w:pPr>
-      <w:r>
-        <w:t>PROFESSIONAL EXPERIENCE</w:t>
-      </w:r>
-    </w:p>
-    <w:p>
-      <w:pPr>
-        <w:pStyle w:val="Heading1"/>
         <w:sectPr>
           <w:type w:val="continuous"/>
           <w:pgSz w:w="11906" w:h="16838"/>
-          <w:pgMar w:top="900" w:right="720" w:bottom="540" w:left="720" w:header="708" w:footer="708" w:gutter="0"/>
+          <w:pgMar w:top="1034" w:right="720" w:bottom="540" w:left="720" w:header="708" w:footer="708" w:gutter="0"/>
           <w:cols w:space="720"/>
           <w:docGrid w:linePitch="360"/>
         </w:sectPr>
       </w:pPr>
+    </w:p>
+    <w:p/>
+    <w:p>
+      <w:pPr>
+        <w:pStyle w:val="Heading1"/>
+      </w:pPr>
+      <w:r>
+        <w:t>PROFESSIONAL EXPERIENCE</w:t>
+      </w:r>
     </w:p>
     <w:p>
       <w:r>
@@ -517,9 +503,11 @@
       <w:pPr>
         <w:pStyle w:val="ListParagraph"/>
       </w:pPr>
+      <w:proofErr w:type="gramStart"/>
       <w:r>
         <w:t>{.}</w:t>
       </w:r>
+      <w:proofErr w:type="gramEnd"/>
     </w:p>
     <w:p>
       <w:r>
@@ -530,17 +518,6 @@
       <w:r>
         <w:t>{/experience}</w:t>
       </w:r>
-    </w:p>
-    <w:p>
-      <w:pPr>
-        <w:sectPr>
-          <w:type w:val="continuous"/>
-          <w:pgSz w:w="11906" w:h="16838"/>
-          <w:pgMar w:top="900" w:right="720" w:bottom="540" w:left="720" w:header="708" w:footer="708" w:gutter="0"/>
-          <w:cols w:space="720"/>
-          <w:docGrid w:linePitch="360"/>
-        </w:sectPr>
-      </w:pPr>
     </w:p>
     <w:p>
       <w:pPr>
@@ -615,9 +592,11 @@
         </w:numPr>
         <w:ind w:left="360"/>
       </w:pPr>
+      <w:proofErr w:type="gramStart"/>
       <w:r>
         <w:t>{.}</w:t>
       </w:r>
+      <w:proofErr w:type="gramEnd"/>
     </w:p>
     <w:p>
       <w:r>
@@ -637,20 +616,8 @@
     <w:p>
       <w:pPr>
         <w:pStyle w:val="Heading1"/>
-        <w:sectPr>
-          <w:pgSz w:w="11906" w:h="16838"/>
-          <w:pgMar w:top="900" w:right="720" w:bottom="540" w:left="720" w:header="708" w:footer="708" w:gutter="0"/>
-          <w:cols w:space="720"/>
-          <w:docGrid w:linePitch="360"/>
-        </w:sectPr>
-      </w:pPr>
-    </w:p>
-    <w:p>
-      <w:pPr>
-        <w:pStyle w:val="Heading1"/>
-      </w:pPr>
-      <w:r>
-        <w:lastRenderedPageBreak/>
+      </w:pPr>
+      <w:r>
         <w:t>EDUCATION</w:t>
       </w:r>
     </w:p>
@@ -712,19 +679,6 @@
       <w:r>
         <w:t>{/education}</w:t>
       </w:r>
-    </w:p>
-    <w:p/>
-    <w:p>
-      <w:pPr>
-        <w:rPr>
-          <w:rFonts w:ascii="Convection Condensed" w:hAnsi="Convection Condensed"/>
-          <w:b/>
-          <w:bCs/>
-          <w:color w:val="B35E06"/>
-          <w:sz w:val="26"/>
-          <w:szCs w:val="26"/>
-        </w:rPr>
-      </w:pPr>
     </w:p>
     <w:sectPr>
       <w:type w:val="continuous"/>
@@ -1908,6 +1862,7 @@
   <w:style w:type="character" w:default="1" w:styleId="DefaultParagraphFont">
     <w:name w:val="Default Paragraph Font"/>
     <w:uiPriority w:val="1"/>
+    <w:semiHidden/>
     <w:unhideWhenUsed/>
   </w:style>
   <w:style w:type="table" w:default="1" w:styleId="TableNormal">

</xml_diff>

<commit_message>
chore: remove unused import from generate-resume script
</commit_message>
<xml_diff>
--- a/resources/resume/2026 resume template.docx
+++ b/resources/resume/2026 resume template.docx
@@ -86,7 +86,7 @@
                                 <w:caps/>
                                 <w:color w:val="FFFFFF" w:themeColor="background1"/>
                               </w:rPr>
-                              <w:t>Jason Vertucio</w:t>
+                              <w:t>{name}</w:t>
                             </w:r>
                           </w:p>
                           <w:p>
@@ -103,7 +103,14 @@
                                 <w:color w:val="FFFFFF" w:themeColor="background1"/>
                                 <w:sz w:val="22"/>
                               </w:rPr>
-                              <w:t xml:space="preserve">Senior Front-End Engineer • </w:t>
+                              <w:t>{title}</w:t>
+                            </w:r>
+                            <w:r>
+                              <w:rPr>
+                                <w:color w:val="FFFFFF" w:themeColor="background1"/>
+                                <w:sz w:val="22"/>
+                              </w:rPr>
+                              <w:t xml:space="preserve"> • </w:t>
                             </w:r>
                             <w:hyperlink r:id="rId8" w:history="1">
                               <w:r>
@@ -113,7 +120,7 @@
                                   <w:sz w:val="22"/>
                                   <w:u w:val="none"/>
                                 </w:rPr>
-                                <w:t>m.jasonvertucio@gmail.com</w:t>
+                                <w:t>{email}</w:t>
                               </w:r>
                             </w:hyperlink>
                             <w:r>
@@ -131,7 +138,7 @@
                                   <w:sz w:val="22"/>
                                   <w:u w:val="none"/>
                                 </w:rPr>
-                                <w:t>(267) 323-5171</w:t>
+                                <w:t>{phone}</w:t>
                               </w:r>
                             </w:hyperlink>
                             <w:r>
@@ -202,7 +209,7 @@
                           <w:caps/>
                           <w:color w:val="FFFFFF" w:themeColor="background1"/>
                         </w:rPr>
-                        <w:t>Jason Vertucio</w:t>
+                        <w:t>{name}</w:t>
                       </w:r>
                     </w:p>
                     <w:p>
@@ -219,7 +226,14 @@
                           <w:color w:val="FFFFFF" w:themeColor="background1"/>
                           <w:sz w:val="22"/>
                         </w:rPr>
-                        <w:t xml:space="preserve">Senior Front-End Engineer • </w:t>
+                        <w:t>{title}</w:t>
+                      </w:r>
+                      <w:r>
+                        <w:rPr>
+                          <w:color w:val="FFFFFF" w:themeColor="background1"/>
+                          <w:sz w:val="22"/>
+                        </w:rPr>
+                        <w:t xml:space="preserve"> • </w:t>
                       </w:r>
                       <w:hyperlink r:id="rId11" w:history="1">
                         <w:r>
@@ -229,7 +243,7 @@
                             <w:sz w:val="22"/>
                             <w:u w:val="none"/>
                           </w:rPr>
-                          <w:t>m.jasonvertucio@gmail.com</w:t>
+                          <w:t>{email}</w:t>
                         </w:r>
                       </w:hyperlink>
                       <w:r>
@@ -247,7 +261,7 @@
                             <w:sz w:val="22"/>
                             <w:u w:val="none"/>
                           </w:rPr>
-                          <w:t>(267) 323-5171</w:t>
+                          <w:t>{phone}</w:t>
                         </w:r>
                       </w:hyperlink>
                       <w:r>
@@ -328,7 +342,6 @@
           <w:docGrid w:linePitch="360"/>
         </w:sectPr>
       </w:pPr>
-      <w:proofErr w:type="gramStart"/>
       <w:r>
         <w:t>{</w:t>
       </w:r>
@@ -338,11 +351,7 @@
       </w:r>
       <w:proofErr w:type="spellEnd"/>
       <w:r>
-        <w:t>}{/</w:t>
-      </w:r>
-      <w:proofErr w:type="gramEnd"/>
-      <w:r>
-        <w:t>top}</w:t>
+        <w:t>}{/top}</w:t>
       </w:r>
     </w:p>
     <w:p>
@@ -503,11 +512,9 @@
       <w:pPr>
         <w:pStyle w:val="ListParagraph"/>
       </w:pPr>
-      <w:proofErr w:type="gramStart"/>
       <w:r>
         <w:t>{.}</w:t>
       </w:r>
-      <w:proofErr w:type="gramEnd"/>
     </w:p>
     <w:p>
       <w:r>
@@ -592,11 +599,9 @@
         </w:numPr>
         <w:ind w:left="360"/>
       </w:pPr>
-      <w:proofErr w:type="gramStart"/>
       <w:r>
         <w:t>{.}</w:t>
       </w:r>
-      <w:proofErr w:type="gramEnd"/>
     </w:p>
     <w:p>
       <w:r>

</xml_diff>

<commit_message>
I FINALLY GOT IT
</commit_message>
<xml_diff>
--- a/resources/resume/2026 resume template.docx
+++ b/resources/resume/2026 resume template.docx
@@ -2,11 +2,11 @@
 <file path=word/document.xml><?xml version="1.0" encoding="utf-8"?>
 <w:document xmlns:wpc="http://schemas.microsoft.com/office/word/2010/wordprocessingCanvas" xmlns:cx="http://schemas.microsoft.com/office/drawing/2014/chartex" xmlns:cx1="http://schemas.microsoft.com/office/drawing/2015/9/8/chartex" xmlns:cx2="http://schemas.microsoft.com/office/drawing/2015/10/21/chartex" xmlns:cx3="http://schemas.microsoft.com/office/drawing/2016/5/9/chartex" xmlns:cx4="http://schemas.microsoft.com/office/drawing/2016/5/10/chartex" xmlns:cx5="http://schemas.microsoft.com/office/drawing/2016/5/11/chartex" xmlns:cx6="http://schemas.microsoft.com/office/drawing/2016/5/12/chartex" xmlns:cx7="http://schemas.microsoft.com/office/drawing/2016/5/13/chartex" xmlns:cx8="http://schemas.microsoft.com/office/drawing/2016/5/14/chartex" xmlns:mc="http://schemas.openxmlformats.org/markup-compatibility/2006" xmlns:aink="http://schemas.microsoft.com/office/drawing/2016/ink" xmlns:am3d="http://schemas.microsoft.com/office/drawing/2017/model3d" xmlns:o="urn:schemas-microsoft-com:office:office" xmlns:oel="http://schemas.microsoft.com/office/2019/extlst" xmlns:r="http://schemas.openxmlformats.org/officeDocument/2006/relationships" xmlns:m="http://schemas.openxmlformats.org/officeDocument/2006/math" xmlns:v="urn:schemas-microsoft-com:vml" xmlns:wp14="http://schemas.microsoft.com/office/word/2010/wordprocessingDrawing" xmlns:wp="http://schemas.openxmlformats.org/drawingml/2006/wordprocessingDrawing" xmlns:w10="urn:schemas-microsoft-com:office:word" xmlns:w="http://schemas.openxmlformats.org/wordprocessingml/2006/main" xmlns:w14="http://schemas.microsoft.com/office/word/2010/wordml" xmlns:w15="http://schemas.microsoft.com/office/word/2012/wordml" xmlns:w16cex="http://schemas.microsoft.com/office/word/2018/wordml/cex" xmlns:w16cid="http://schemas.microsoft.com/office/word/2016/wordml/cid" xmlns:w16="http://schemas.microsoft.com/office/word/2018/wordml" xmlns:w16du="http://schemas.microsoft.com/office/word/2023/wordml/word16du" xmlns:w16sdtdh="http://schemas.microsoft.com/office/word/2020/wordml/sdtdatahash" xmlns:w16sdtfl="http://schemas.microsoft.com/office/word/2024/wordml/sdtformatlock" xmlns:w16se="http://schemas.microsoft.com/office/word/2015/wordml/symex" xmlns:wpg="http://schemas.microsoft.com/office/word/2010/wordprocessingGroup" xmlns:wpi="http://schemas.microsoft.com/office/word/2010/wordprocessingInk" xmlns:wne="http://schemas.microsoft.com/office/word/2006/wordml" xmlns:wps="http://schemas.microsoft.com/office/word/2010/wordprocessingShape" mc:Ignorable="w14 w15 w16se w16cid w16 w16cex w16sdtdh w16sdtfl w16du wp14">
   <w:body>
+    <w:bookmarkStart w:id="0" w:name="_Hlk211971945"/>
     <w:p>
       <w:pPr>
         <w:pStyle w:val="Heading1"/>
       </w:pPr>
-      <w:bookmarkStart w:id="0" w:name="_Hlk211971945"/>
       <w:r>
         <w:rPr>
           <w:noProof/>
@@ -342,6 +342,7 @@
           <w:docGrid w:linePitch="360"/>
         </w:sectPr>
       </w:pPr>
+      <w:proofErr w:type="gramStart"/>
       <w:r>
         <w:t>{</w:t>
       </w:r>
@@ -351,7 +352,11 @@
       </w:r>
       <w:proofErr w:type="spellEnd"/>
       <w:r>
-        <w:t>}{/top}</w:t>
+        <w:t>}{/</w:t>
+      </w:r>
+      <w:proofErr w:type="gramEnd"/>
+      <w:r>
+        <w:t>top}</w:t>
       </w:r>
     </w:p>
     <w:p>
@@ -512,9 +517,11 @@
       <w:pPr>
         <w:pStyle w:val="ListParagraph"/>
       </w:pPr>
+      <w:proofErr w:type="gramStart"/>
       <w:r>
         <w:t>{.}</w:t>
       </w:r>
+      <w:proofErr w:type="gramEnd"/>
     </w:p>
     <w:p>
       <w:r>
@@ -599,9 +606,11 @@
         </w:numPr>
         <w:ind w:left="360"/>
       </w:pPr>
+      <w:proofErr w:type="gramStart"/>
       <w:r>
         <w:t>{.}</w:t>
       </w:r>
+      <w:proofErr w:type="gramEnd"/>
     </w:p>
     <w:p>
       <w:r>

</xml_diff>

<commit_message>
feat: update resume templates for 2026
</commit_message>
<xml_diff>
--- a/resources/resume/2026 resume template.docx
+++ b/resources/resume/2026 resume template.docx
@@ -2,11 +2,11 @@
 <file path=word/document.xml><?xml version="1.0" encoding="utf-8"?>
 <w:document xmlns:wpc="http://schemas.microsoft.com/office/word/2010/wordprocessingCanvas" xmlns:cx="http://schemas.microsoft.com/office/drawing/2014/chartex" xmlns:cx1="http://schemas.microsoft.com/office/drawing/2015/9/8/chartex" xmlns:cx2="http://schemas.microsoft.com/office/drawing/2015/10/21/chartex" xmlns:cx3="http://schemas.microsoft.com/office/drawing/2016/5/9/chartex" xmlns:cx4="http://schemas.microsoft.com/office/drawing/2016/5/10/chartex" xmlns:cx5="http://schemas.microsoft.com/office/drawing/2016/5/11/chartex" xmlns:cx6="http://schemas.microsoft.com/office/drawing/2016/5/12/chartex" xmlns:cx7="http://schemas.microsoft.com/office/drawing/2016/5/13/chartex" xmlns:cx8="http://schemas.microsoft.com/office/drawing/2016/5/14/chartex" xmlns:mc="http://schemas.openxmlformats.org/markup-compatibility/2006" xmlns:aink="http://schemas.microsoft.com/office/drawing/2016/ink" xmlns:am3d="http://schemas.microsoft.com/office/drawing/2017/model3d" xmlns:o="urn:schemas-microsoft-com:office:office" xmlns:oel="http://schemas.microsoft.com/office/2019/extlst" xmlns:r="http://schemas.openxmlformats.org/officeDocument/2006/relationships" xmlns:m="http://schemas.openxmlformats.org/officeDocument/2006/math" xmlns:v="urn:schemas-microsoft-com:vml" xmlns:wp14="http://schemas.microsoft.com/office/word/2010/wordprocessingDrawing" xmlns:wp="http://schemas.openxmlformats.org/drawingml/2006/wordprocessingDrawing" xmlns:w10="urn:schemas-microsoft-com:office:word" xmlns:w="http://schemas.openxmlformats.org/wordprocessingml/2006/main" xmlns:w14="http://schemas.microsoft.com/office/word/2010/wordml" xmlns:w15="http://schemas.microsoft.com/office/word/2012/wordml" xmlns:w16cex="http://schemas.microsoft.com/office/word/2018/wordml/cex" xmlns:w16cid="http://schemas.microsoft.com/office/word/2016/wordml/cid" xmlns:w16="http://schemas.microsoft.com/office/word/2018/wordml" xmlns:w16du="http://schemas.microsoft.com/office/word/2023/wordml/word16du" xmlns:w16sdtdh="http://schemas.microsoft.com/office/word/2020/wordml/sdtdatahash" xmlns:w16sdtfl="http://schemas.microsoft.com/office/word/2024/wordml/sdtformatlock" xmlns:w16se="http://schemas.microsoft.com/office/word/2015/wordml/symex" xmlns:wpg="http://schemas.microsoft.com/office/word/2010/wordprocessingGroup" xmlns:wpi="http://schemas.microsoft.com/office/word/2010/wordprocessingInk" xmlns:wne="http://schemas.microsoft.com/office/word/2006/wordml" xmlns:wps="http://schemas.microsoft.com/office/word/2010/wordprocessingShape" mc:Ignorable="w14 w15 w16se w16cid w16 w16cex w16sdtdh w16sdtfl w16du wp14">
   <w:body>
-    <w:bookmarkStart w:id="0" w:name="_Hlk211971945"/>
     <w:p>
       <w:pPr>
         <w:pStyle w:val="Heading1"/>
       </w:pPr>
+      <w:bookmarkStart w:id="0" w:name="_Hlk211971945"/>
       <w:r>
         <w:rPr>
           <w:noProof/>
@@ -15,16 +15,16 @@
         <mc:AlternateContent>
           <mc:Choice Requires="wps">
             <w:drawing>
-              <wp:anchor distT="0" distB="0" distL="114300" distR="114300" simplePos="0" relativeHeight="251659264" behindDoc="1" locked="0" layoutInCell="1" allowOverlap="1" wp14:anchorId="4A187B5F" wp14:editId="25E14134">
+              <wp:anchor distT="0" distB="0" distL="114300" distR="114300" simplePos="0" relativeHeight="251659264" behindDoc="1" locked="0" layoutInCell="1" allowOverlap="1" wp14:anchorId="4A187B5F" wp14:editId="1D1A037D">
                 <wp:simplePos x="0" y="0"/>
                 <wp:positionH relativeFrom="page">
-                  <wp:posOffset>-133350</wp:posOffset>
+                  <wp:posOffset>0</wp:posOffset>
                 </wp:positionH>
                 <wp:positionV relativeFrom="page">
-                  <wp:posOffset>12700</wp:posOffset>
+                  <wp:posOffset>0</wp:posOffset>
                 </wp:positionV>
-                <wp:extent cx="7799832" cy="654050"/>
-                <wp:effectExtent l="0" t="0" r="10795" b="12700"/>
+                <wp:extent cx="7772400" cy="658368"/>
+                <wp:effectExtent l="0" t="0" r="19050" b="27940"/>
                 <wp:wrapNone/>
                 <wp:docPr id="1183410925" name="Rectangle 1">
                   <a:extLst xmlns:a="http://schemas.openxmlformats.org/drawingml/2006/main">
@@ -41,7 +41,7 @@
                       <wps:spPr>
                         <a:xfrm>
                           <a:off x="0" y="0"/>
-                          <a:ext cx="7799832" cy="654050"/>
+                          <a:ext cx="7772400" cy="658368"/>
                         </a:xfrm>
                         <a:prstGeom prst="rect">
                           <a:avLst/>
@@ -193,7 +193,7 @@
           </mc:Choice>
           <mc:Fallback>
             <w:pict>
-              <v:rect w14:anchorId="4A187B5F" id="Rectangle 1" o:spid="_x0000_s1026" alt="&quot;&quot;" style="position:absolute;margin-left:-10.5pt;margin-top:1pt;width:614.15pt;height:51.5pt;z-index:-251657216;visibility:visible;mso-wrap-style:square;mso-width-percent:0;mso-height-percent:0;mso-wrap-distance-left:9pt;mso-wrap-distance-top:0;mso-wrap-distance-right:9pt;mso-wrap-distance-bottom:0;mso-position-horizontal:absolute;mso-position-horizontal-relative:page;mso-position-vertical:absolute;mso-position-vertical-relative:page;mso-width-percent:0;mso-height-percent:0;mso-width-relative:margin;mso-height-relative:margin;v-text-anchor:middle" o:gfxdata="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" fillcolor="#1b587c" strokecolor="#1b587c" strokeweight="1.5pt">
+              <v:rect w14:anchorId="4A187B5F" id="Rectangle 1" o:spid="_x0000_s1026" alt="&quot;&quot;" style="position:absolute;margin-left:0;margin-top:0;width:612pt;height:51.85pt;z-index:-251657216;visibility:visible;mso-wrap-style:square;mso-width-percent:0;mso-height-percent:0;mso-wrap-distance-left:9pt;mso-wrap-distance-top:0;mso-wrap-distance-right:9pt;mso-wrap-distance-bottom:0;mso-position-horizontal:absolute;mso-position-horizontal-relative:page;mso-position-vertical:absolute;mso-position-vertical-relative:page;mso-width-percent:0;mso-height-percent:0;mso-width-relative:margin;mso-height-relative:margin;v-text-anchor:middle" o:gfxdata="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" fillcolor="#1b587c" strokecolor="#1b587c" strokeweight="1.5pt">
                 <v:textbox>
                   <w:txbxContent>
                     <w:p>
@@ -336,7 +336,7 @@
         <w:sectPr>
           <w:headerReference w:type="default" r:id="rId14"/>
           <w:type w:val="continuous"/>
-          <w:pgSz w:w="11906" w:h="16838"/>
+          <w:pgSz w:w="12240" w:h="15840" w:code="1"/>
           <w:pgMar w:top="1034" w:right="720" w:bottom="540" w:left="720" w:header="708" w:footer="708" w:gutter="0"/>
           <w:cols w:space="720"/>
           <w:docGrid w:linePitch="360"/>
@@ -394,7 +394,7 @@
       <w:pPr>
         <w:sectPr>
           <w:type w:val="continuous"/>
-          <w:pgSz w:w="11906" w:h="16838"/>
+          <w:pgSz w:w="12240" w:h="15840" w:code="1"/>
           <w:pgMar w:top="1034" w:right="720" w:bottom="540" w:left="720" w:header="708" w:footer="708" w:gutter="0"/>
           <w:cols w:num="2" w:space="720"/>
           <w:docGrid w:linePitch="360"/>
@@ -408,7 +408,7 @@
       <w:pPr>
         <w:sectPr>
           <w:type w:val="continuous"/>
-          <w:pgSz w:w="11906" w:h="16838"/>
+          <w:pgSz w:w="12240" w:h="15840" w:code="1"/>
           <w:pgMar w:top="1034" w:right="720" w:bottom="540" w:left="720" w:header="708" w:footer="708" w:gutter="0"/>
           <w:cols w:space="720"/>
           <w:docGrid w:linePitch="360"/>
@@ -522,6 +522,9 @@
         <w:t>{.}</w:t>
       </w:r>
       <w:proofErr w:type="gramEnd"/>
+      <w:r>
+        <w:tab/>
+      </w:r>
     </w:p>
     <w:p>
       <w:r>
@@ -696,7 +699,7 @@
     </w:p>
     <w:sectPr>
       <w:type w:val="continuous"/>
-      <w:pgSz w:w="11906" w:h="16838"/>
+      <w:pgSz w:w="12240" w:h="15840" w:code="1"/>
       <w:pgMar w:top="1034" w:right="720" w:bottom="540" w:left="720" w:header="708" w:footer="708" w:gutter="0"/>
       <w:cols w:space="720"/>
       <w:docGrid w:linePitch="360"/>

</xml_diff>

<commit_message>
feat: Enhance date handling in resume data service and update template documentation
</commit_message>
<xml_diff>
--- a/resources/resume/2026 resume template.docx
+++ b/resources/resume/2026 resume template.docx
@@ -456,50 +456,7 @@
         <w:rPr>
           <w:color w:val="666666"/>
         </w:rPr>
-        <w:t>•</w:t>
-      </w:r>
-      <w:r>
-        <w:t xml:space="preserve"> </w:t>
-      </w:r>
-      <w:r>
-        <w:t>{</w:t>
-      </w:r>
-      <w:proofErr w:type="spellStart"/>
-      <w:r>
-        <w:t>dateStart</w:t>
-      </w:r>
-      <w:proofErr w:type="spellEnd"/>
-      <w:r>
-        <w:t xml:space="preserve">} </w:t>
-      </w:r>
-      <w:r>
-        <w:t>–</w:t>
-      </w:r>
-      <w:r>
-        <w:t xml:space="preserve"> {</w:t>
-      </w:r>
-      <w:proofErr w:type="spellStart"/>
-      <w:r>
-        <w:t>date</w:t>
-      </w:r>
-      <w:r>
-        <w:t>E</w:t>
-      </w:r>
-      <w:r>
-        <w:t>nd</w:t>
-      </w:r>
-      <w:proofErr w:type="spellEnd"/>
-      <w:r>
-        <w:t>}</w:t>
-      </w:r>
-      <w:r>
-        <w:t xml:space="preserve"> </w:t>
-      </w:r>
-      <w:r>
-        <w:rPr>
-          <w:color w:val="666666"/>
-        </w:rPr>
-        <w:t>•</w:t>
+        <w:t xml:space="preserve">{dateDisplay}</w:t>
       </w:r>
       <w:r>
         <w:t xml:space="preserve"> {location}</w:t>
@@ -659,32 +616,7 @@
         <w:t>{degree}</w:t>
       </w:r>
       <w:r>
-        <w:t xml:space="preserve"> • </w:t>
-      </w:r>
-      <w:r>
-        <w:t>{</w:t>
-      </w:r>
-      <w:proofErr w:type="spellStart"/>
-      <w:r>
-        <w:t>dateStart</w:t>
-      </w:r>
-      <w:proofErr w:type="spellEnd"/>
-      <w:r>
-        <w:t>}</w:t>
-      </w:r>
-      <w:r>
-        <w:t xml:space="preserve"> – </w:t>
-      </w:r>
-      <w:r>
-        <w:t>{</w:t>
-      </w:r>
-      <w:proofErr w:type="spellStart"/>
-      <w:r>
-        <w:t>dateEnd</w:t>
-      </w:r>
-      <w:proofErr w:type="spellEnd"/>
-      <w:r>
-        <w:t>}</w:t>
+        <w:t xml:space="preserve">{dateDisplay}</w:t>
       </w:r>
     </w:p>
     <w:p>

</xml_diff>

<commit_message>
feat: Add location and level fields to ResumeEducation model and update related components
</commit_message>
<xml_diff>
--- a/resources/resume/2026 resume template.docx
+++ b/resources/resume/2026 resume template.docx
@@ -704,35 +704,7 @@
         <w:pStyle w:val="CompanyInfo"/>
       </w:pPr>
       <w:r>
-        <w:t>{degree}</w:t>
-      </w:r>
-      <w:r>
-        <w:t xml:space="preserve"> • </w:t>
-      </w:r>
-      <w:r>
-        <w:t>{</w:t>
-      </w:r>
-      <w:proofErr w:type="spellStart"/>
-      <w:r>
-        <w:t>dateStart</w:t>
-      </w:r>
-      <w:proofErr w:type="spellEnd"/>
-      <w:r>
-        <w:t>}</w:t>
-      </w:r>
-      <w:r>
-        <w:t xml:space="preserve"> – </w:t>
-      </w:r>
-      <w:r>
-        <w:t>{</w:t>
-      </w:r>
-      <w:proofErr w:type="spellStart"/>
-      <w:r>
-        <w:t>dateEnd</w:t>
-      </w:r>
-      <w:proofErr w:type="spellEnd"/>
-      <w:r>
-        <w:t>}</w:t>
+        <w:t>{metaLine}</w:t>
       </w:r>
     </w:p>
     <w:p>

</xml_diff>

<commit_message>
bugfix: Refactor section breaks for proper formatting
</commit_message>
<xml_diff>
--- a/resources/resume/2026 resume template.docx
+++ b/resources/resume/2026 resume template.docx
@@ -207,14 +207,12 @@
                       <w:pPr>
                         <w:pStyle w:val="Title"/>
                         <w:rPr>
-                          <w:rFonts w:ascii="Josefin Sans" w:hAnsi="Josefin Sans"/>
                           <w:caps/>
                           <w:color w:val="FFFFFF" w:themeColor="background1"/>
                         </w:rPr>
                       </w:pPr>
                       <w:r>
                         <w:rPr>
-                          <w:rFonts w:ascii="Josefin Sans" w:hAnsi="Josefin Sans"/>
                           <w:caps/>
                           <w:color w:val="FFFFFF" w:themeColor="background1"/>
                         </w:rPr>
@@ -246,7 +244,7 @@
                         </w:rPr>
                         <w:t xml:space="preserve"> • </w:t>
                       </w:r>
-                      <w:hyperlink r:id="rId13" w:history="1">
+                      <w:hyperlink r:id="rId10" w:history="1">
                         <w:r>
                           <w:rPr>
                             <w:rStyle w:val="Hyperlink"/>
@@ -266,7 +264,7 @@
                         </w:rPr>
                         <w:t xml:space="preserve"> • </w:t>
                       </w:r>
-                      <w:hyperlink r:id="rId14" w:history="1">
+                      <w:hyperlink r:id="rId11" w:history="1">
                         <w:r>
                           <w:rPr>
                             <w:rStyle w:val="Hyperlink"/>
@@ -326,54 +324,70 @@
     <w:p>
       <w:pPr>
         <w:spacing w:after="120"/>
+      </w:pPr>
+      <w:r>
+        <w:t>{summary}</w:t>
+      </w:r>
+    </w:p>
+    <w:p>
+      <w:pPr>
+        <w:pStyle w:val="Heading1"/>
         <w:sectPr>
-          <w:type w:val="continuous"/>
+          <w:headerReference w:type="default" r:id="rId12"/>
           <w:pgSz w:w="11906" w:h="16838"/>
-          <w:pgMar w:top="948" w:right="720" w:bottom="540" w:left="720" w:header="708" w:footer="708" w:gutter="0"/>
+          <w:pgMar w:top="900" w:right="720" w:bottom="540" w:left="720" w:header="708" w:footer="708" w:gutter="0"/>
           <w:cols w:space="720"/>
           <w:docGrid w:linePitch="360"/>
         </w:sectPr>
       </w:pPr>
-      <w:r>
-        <w:t>{summary}</w:t>
-      </w:r>
     </w:p>
     <w:p>
       <w:pPr>
         <w:pStyle w:val="Heading1"/>
+      </w:pPr>
+      <w:r>
+        <w:t>TECHNICAL SKILLS</w:t>
+      </w:r>
+      <w:r>
+        <w:t>{#</w:t>
+      </w:r>
+      <w:r>
+        <w:t>skills</w:t>
+      </w:r>
+      <w:r>
+        <w:t>}{#top}</w:t>
+      </w:r>
+    </w:p>
+    <w:p>
+      <w:pPr>
+        <w:pStyle w:val="Heading2"/>
+      </w:pPr>
+      <w:r>
+        <w:t>{title}</w:t>
+      </w:r>
+    </w:p>
+    <w:p>
+      <w:proofErr w:type="gramStart"/>
+      <w:r>
+        <w:t>{</w:t>
+      </w:r>
+      <w:proofErr w:type="spellStart"/>
+      <w:r>
+        <w:t>listJoined</w:t>
+      </w:r>
+      <w:proofErr w:type="spellEnd"/>
+      <w:r>
+        <w:t>}{/</w:t>
+      </w:r>
+      <w:proofErr w:type="gramEnd"/>
+      <w:r>
+        <w:t>top}</w:t>
+      </w:r>
+    </w:p>
+    <w:p>
+      <w:pPr>
+        <w:pStyle w:val="Heading2"/>
         <w:sectPr>
-          <w:type w:val="continuous"/>
-          <w:pgSz w:w="11906" w:h="16838"/>
-          <w:pgMar w:top="1440" w:right="720" w:bottom="540" w:left="720" w:header="708" w:footer="708" w:gutter="0"/>
-          <w:cols w:space="720"/>
-          <w:docGrid w:linePitch="360"/>
-        </w:sectPr>
-      </w:pPr>
-      <w:r>
-        <w:t>TECHNICAL SKILLS</w:t>
-      </w:r>
-    </w:p>
-    <w:p>
-      <w:pPr>
-        <w:pStyle w:val="Heading2"/>
-      </w:pPr>
-      <w:r>
-        <w:t>{#</w:t>
-      </w:r>
-      <w:r>
-        <w:t>skills</w:t>
-      </w:r>
-      <w:r>
-        <w:t>}{#top}</w:t>
-      </w:r>
-      <w:r>
-        <w:t>{title}</w:t>
-      </w:r>
-    </w:p>
-    <w:p>
-      <w:pPr>
-        <w:sectPr>
-          <w:headerReference w:type="default" r:id="rId15"/>
           <w:type w:val="continuous"/>
           <w:pgSz w:w="11906" w:h="16838"/>
           <w:pgMar w:top="900" w:right="720" w:bottom="540" w:left="720" w:header="708" w:footer="708" w:gutter="0"/>
@@ -381,22 +395,6 @@
           <w:docGrid w:linePitch="360"/>
         </w:sectPr>
       </w:pPr>
-      <w:proofErr w:type="gramStart"/>
-      <w:r>
-        <w:t>{</w:t>
-      </w:r>
-      <w:proofErr w:type="spellStart"/>
-      <w:r>
-        <w:t>listJoined</w:t>
-      </w:r>
-      <w:proofErr w:type="spellEnd"/>
-      <w:r>
-        <w:t>}{/</w:t>
-      </w:r>
-      <w:proofErr w:type="gramEnd"/>
-      <w:r>
-        <w:t>top}</w:t>
-      </w:r>
     </w:p>
     <w:p>
       <w:r>
@@ -447,15 +445,6 @@
     </w:p>
     <w:p>
       <w:pPr>
-        <w:pStyle w:val="Heading1"/>
-      </w:pPr>
-      <w:r>
-        <w:t>PROFESSIONAL EXPERIENCE</w:t>
-      </w:r>
-    </w:p>
-    <w:p>
-      <w:pPr>
-        <w:pStyle w:val="Heading1"/>
         <w:sectPr>
           <w:type w:val="continuous"/>
           <w:pgSz w:w="11906" w:h="16838"/>
@@ -466,6 +455,14 @@
       </w:pPr>
     </w:p>
     <w:p>
+      <w:pPr>
+        <w:pStyle w:val="Heading1"/>
+      </w:pPr>
+      <w:r>
+        <w:t>PROFESSIONAL EXPERIENCE</w:t>
+      </w:r>
+    </w:p>
+    <w:p>
       <w:r>
         <w:t>{#experience}</w:t>
       </w:r>
@@ -581,6 +578,8 @@
     </w:p>
     <w:p>
       <w:pPr>
+        <w:pStyle w:val="Heading1"/>
+        <w:keepLines/>
         <w:sectPr>
           <w:type w:val="continuous"/>
           <w:pgSz w:w="11906" w:h="16838"/>
@@ -596,7 +595,6 @@
         <w:keepLines/>
       </w:pPr>
       <w:r>
-        <w:lastRenderedPageBreak/>
         <w:t>SELECTED PROJECTS</w:t>
       </w:r>
     </w:p>
@@ -671,6 +669,7 @@
       <w:pPr>
         <w:pStyle w:val="Heading1"/>
         <w:sectPr>
+          <w:type w:val="continuous"/>
           <w:pgSz w:w="11906" w:h="16838"/>
           <w:pgMar w:top="900" w:right="720" w:bottom="540" w:left="720" w:header="708" w:footer="708" w:gutter="0"/>
           <w:cols w:space="720"/>

</xml_diff>

<commit_message>
bugfix: Refactor section breaks for proper formatting (#20)
* bugfix: Refactor section breaks for proper formatting
</commit_message>
<xml_diff>
--- a/resources/resume/2026 resume template.docx
+++ b/resources/resume/2026 resume template.docx
@@ -2,11 +2,11 @@
 <file path=word/document.xml><?xml version="1.0" encoding="utf-8"?>
 <w:document xmlns:wpc="http://schemas.microsoft.com/office/word/2010/wordprocessingCanvas" xmlns:cx="http://schemas.microsoft.com/office/drawing/2014/chartex" xmlns:cx1="http://schemas.microsoft.com/office/drawing/2015/9/8/chartex" xmlns:cx2="http://schemas.microsoft.com/office/drawing/2015/10/21/chartex" xmlns:cx3="http://schemas.microsoft.com/office/drawing/2016/5/9/chartex" xmlns:cx4="http://schemas.microsoft.com/office/drawing/2016/5/10/chartex" xmlns:cx5="http://schemas.microsoft.com/office/drawing/2016/5/11/chartex" xmlns:cx6="http://schemas.microsoft.com/office/drawing/2016/5/12/chartex" xmlns:cx7="http://schemas.microsoft.com/office/drawing/2016/5/13/chartex" xmlns:cx8="http://schemas.microsoft.com/office/drawing/2016/5/14/chartex" xmlns:mc="http://schemas.openxmlformats.org/markup-compatibility/2006" xmlns:aink="http://schemas.microsoft.com/office/drawing/2016/ink" xmlns:am3d="http://schemas.microsoft.com/office/drawing/2017/model3d" xmlns:o="urn:schemas-microsoft-com:office:office" xmlns:oel="http://schemas.microsoft.com/office/2019/extlst" xmlns:r="http://schemas.openxmlformats.org/officeDocument/2006/relationships" xmlns:m="http://schemas.openxmlformats.org/officeDocument/2006/math" xmlns:v="urn:schemas-microsoft-com:vml" xmlns:wp14="http://schemas.microsoft.com/office/word/2010/wordprocessingDrawing" xmlns:wp="http://schemas.openxmlformats.org/drawingml/2006/wordprocessingDrawing" xmlns:w10="urn:schemas-microsoft-com:office:word" xmlns:w="http://schemas.openxmlformats.org/wordprocessingml/2006/main" xmlns:w14="http://schemas.microsoft.com/office/word/2010/wordml" xmlns:w15="http://schemas.microsoft.com/office/word/2012/wordml" xmlns:w16cex="http://schemas.microsoft.com/office/word/2018/wordml/cex" xmlns:w16cid="http://schemas.microsoft.com/office/word/2016/wordml/cid" xmlns:w16="http://schemas.microsoft.com/office/word/2018/wordml" xmlns:w16du="http://schemas.microsoft.com/office/word/2023/wordml/word16du" xmlns:w16sdtdh="http://schemas.microsoft.com/office/word/2020/wordml/sdtdatahash" xmlns:w16sdtfl="http://schemas.microsoft.com/office/word/2024/wordml/sdtformatlock" xmlns:w16se="http://schemas.microsoft.com/office/word/2015/wordml/symex" xmlns:wpg="http://schemas.microsoft.com/office/word/2010/wordprocessingGroup" xmlns:wpi="http://schemas.microsoft.com/office/word/2010/wordprocessingInk" xmlns:wne="http://schemas.microsoft.com/office/word/2006/wordml" xmlns:wps="http://schemas.microsoft.com/office/word/2010/wordprocessingShape" mc:Ignorable="w14 w15 w16se w16cid w16 w16cex w16sdtdh w16sdtfl w16du wp14">
   <w:body>
-    <w:bookmarkStart w:id="0" w:name="_Hlk211971945"/>
     <w:p>
       <w:pPr>
         <w:pStyle w:val="Heading1"/>
       </w:pPr>
+      <w:bookmarkStart w:id="0" w:name="_Hlk211971945"/>
       <w:r>
         <w:rPr>
           <w:noProof/>
@@ -15,16 +15,16 @@
         <mc:AlternateContent>
           <mc:Choice Requires="wps">
             <w:drawing>
-              <wp:anchor distT="0" distB="0" distL="114300" distR="114300" simplePos="0" relativeHeight="251659264" behindDoc="1" locked="0" layoutInCell="1" allowOverlap="1" wp14:anchorId="4A187B5F" wp14:editId="25E14134">
+              <wp:anchor distT="0" distB="0" distL="114300" distR="114300" simplePos="0" relativeHeight="251659264" behindDoc="1" locked="0" layoutInCell="1" allowOverlap="1" wp14:anchorId="4A187B5F" wp14:editId="776B79AB">
                 <wp:simplePos x="0" y="0"/>
                 <wp:positionH relativeFrom="page">
-                  <wp:posOffset>-133350</wp:posOffset>
+                  <wp:posOffset>0</wp:posOffset>
                 </wp:positionH>
                 <wp:positionV relativeFrom="page">
-                  <wp:posOffset>12700</wp:posOffset>
+                  <wp:posOffset>0</wp:posOffset>
                 </wp:positionV>
-                <wp:extent cx="7799832" cy="654050"/>
-                <wp:effectExtent l="0" t="0" r="10795" b="12700"/>
+                <wp:extent cx="7772400" cy="658368"/>
+                <wp:effectExtent l="0" t="0" r="19050" b="27940"/>
                 <wp:wrapNone/>
                 <wp:docPr id="1183410925" name="Rectangle 1">
                   <a:extLst xmlns:a="http://schemas.openxmlformats.org/drawingml/2006/main">
@@ -41,7 +41,7 @@
                       <wps:spPr>
                         <a:xfrm>
                           <a:off x="0" y="0"/>
-                          <a:ext cx="7799832" cy="654050"/>
+                          <a:ext cx="7772400" cy="658368"/>
                         </a:xfrm>
                         <a:prstGeom prst="rect">
                           <a:avLst/>
@@ -200,21 +200,19 @@
           </mc:Choice>
           <mc:Fallback>
             <w:pict>
-              <v:rect w14:anchorId="4A187B5F" id="Rectangle 1" o:spid="_x0000_s1026" alt="&quot;&quot;" style="position:absolute;left:0;text-align:left;margin-left:-10.5pt;margin-top:1pt;width:614.15pt;height:51.5pt;z-index:-251657216;visibility:visible;mso-wrap-style:square;mso-width-percent:0;mso-height-percent:0;mso-wrap-distance-left:9pt;mso-wrap-distance-top:0;mso-wrap-distance-right:9pt;mso-wrap-distance-bottom:0;mso-position-horizontal:absolute;mso-position-horizontal-relative:page;mso-position-vertical:absolute;mso-position-vertical-relative:page;mso-width-percent:0;mso-height-percent:0;mso-width-relative:margin;mso-height-relative:margin;v-text-anchor:middle" o:gfxdata="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" fillcolor="#1b587c" strokecolor="#1b587c" strokeweight="1.5pt">
+              <v:rect w14:anchorId="4A187B5F" id="Rectangle 1" o:spid="_x0000_s1026" alt="&quot;&quot;" style="position:absolute;left:0;text-align:left;margin-left:0;margin-top:0;width:612pt;height:51.85pt;z-index:-251657216;visibility:visible;mso-wrap-style:square;mso-width-percent:0;mso-height-percent:0;mso-wrap-distance-left:9pt;mso-wrap-distance-top:0;mso-wrap-distance-right:9pt;mso-wrap-distance-bottom:0;mso-position-horizontal:absolute;mso-position-horizontal-relative:page;mso-position-vertical:absolute;mso-position-vertical-relative:page;mso-width-percent:0;mso-height-percent:0;mso-width-relative:margin;mso-height-relative:margin;v-text-anchor:middle" o:gfxdata="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" fillcolor="#1b587c" strokecolor="#1b587c" strokeweight="1.5pt">
                 <v:textbox>
                   <w:txbxContent>
                     <w:p>
                       <w:pPr>
                         <w:pStyle w:val="Title"/>
                         <w:rPr>
-                          <w:rFonts w:ascii="Josefin Sans" w:hAnsi="Josefin Sans"/>
                           <w:caps/>
                           <w:color w:val="FFFFFF" w:themeColor="background1"/>
                         </w:rPr>
                       </w:pPr>
                       <w:r>
                         <w:rPr>
-                          <w:rFonts w:ascii="Josefin Sans" w:hAnsi="Josefin Sans"/>
                           <w:caps/>
                           <w:color w:val="FFFFFF" w:themeColor="background1"/>
                         </w:rPr>
@@ -246,7 +244,7 @@
                         </w:rPr>
                         <w:t xml:space="preserve"> • </w:t>
                       </w:r>
-                      <w:hyperlink r:id="rId13" w:history="1">
+                      <w:hyperlink r:id="rId10" w:history="1">
                         <w:r>
                           <w:rPr>
                             <w:rStyle w:val="Hyperlink"/>
@@ -266,7 +264,7 @@
                         </w:rPr>
                         <w:t xml:space="preserve"> • </w:t>
                       </w:r>
-                      <w:hyperlink r:id="rId14" w:history="1">
+                      <w:hyperlink r:id="rId11" w:history="1">
                         <w:r>
                           <w:rPr>
                             <w:rStyle w:val="Hyperlink"/>
@@ -326,61 +324,50 @@
     <w:p>
       <w:pPr>
         <w:spacing w:after="120"/>
+      </w:pPr>
+      <w:r>
+        <w:t>{summary}</w:t>
+      </w:r>
+    </w:p>
+    <w:p>
+      <w:pPr>
+        <w:spacing w:after="120"/>
         <w:sectPr>
+          <w:headerReference w:type="default" r:id="rId12"/>
           <w:type w:val="continuous"/>
-          <w:pgSz w:w="11906" w:h="16838"/>
-          <w:pgMar w:top="948" w:right="720" w:bottom="540" w:left="720" w:header="708" w:footer="708" w:gutter="0"/>
-          <w:cols w:space="720"/>
-          <w:docGrid w:linePitch="360"/>
-        </w:sectPr>
-      </w:pPr>
-      <w:r>
-        <w:t>{summary}</w:t>
-      </w:r>
-    </w:p>
-    <w:p>
-      <w:pPr>
-        <w:pStyle w:val="Heading1"/>
-        <w:sectPr>
-          <w:type w:val="continuous"/>
-          <w:pgSz w:w="11906" w:h="16838"/>
-          <w:pgMar w:top="1440" w:right="720" w:bottom="540" w:left="720" w:header="708" w:footer="708" w:gutter="0"/>
-          <w:cols w:space="720"/>
-          <w:docGrid w:linePitch="360"/>
-        </w:sectPr>
-      </w:pPr>
-      <w:r>
-        <w:t>TECHNICAL SKILLS</w:t>
-      </w:r>
-    </w:p>
-    <w:p>
-      <w:pPr>
-        <w:pStyle w:val="Heading2"/>
-      </w:pPr>
-      <w:r>
-        <w:t>{#</w:t>
-      </w:r>
-      <w:r>
-        <w:t>skills</w:t>
-      </w:r>
-      <w:r>
-        <w:t>}{#top}</w:t>
-      </w:r>
-      <w:r>
-        <w:t>{title}</w:t>
-      </w:r>
-    </w:p>
-    <w:p>
-      <w:pPr>
-        <w:sectPr>
-          <w:headerReference w:type="default" r:id="rId15"/>
-          <w:type w:val="continuous"/>
-          <w:pgSz w:w="11906" w:h="16838"/>
+          <w:pgSz w:w="12240" w:h="15840" w:code="1"/>
           <w:pgMar w:top="900" w:right="720" w:bottom="540" w:left="720" w:header="708" w:footer="708" w:gutter="0"/>
           <w:cols w:space="720"/>
           <w:docGrid w:linePitch="360"/>
         </w:sectPr>
       </w:pPr>
+    </w:p>
+    <w:p>
+      <w:pPr>
+        <w:pStyle w:val="Heading1"/>
+      </w:pPr>
+      <w:r>
+        <w:t>TECHNICAL SKILLS</w:t>
+      </w:r>
+      <w:r>
+        <w:t>{#</w:t>
+      </w:r>
+      <w:r>
+        <w:t>skills</w:t>
+      </w:r>
+      <w:r>
+        <w:t>}{#top}</w:t>
+      </w:r>
+    </w:p>
+    <w:p>
+      <w:pPr>
+        <w:pStyle w:val="Heading2"/>
+      </w:pPr>
+      <w:r>
+        <w:t>{title}</w:t>
+      </w:r>
+    </w:p>
+    <w:p>
       <w:proofErr w:type="gramStart"/>
       <w:r>
         <w:t>{</w:t>
@@ -396,44 +383,55 @@
       <w:proofErr w:type="gramEnd"/>
       <w:r>
         <w:t>top}</w:t>
-      </w:r>
-    </w:p>
-    <w:p>
-      <w:r>
-        <w:t>{#other}</w:t>
-      </w:r>
-    </w:p>
-    <w:p>
-      <w:pPr>
-        <w:pStyle w:val="Heading2"/>
-      </w:pPr>
-      <w:r>
-        <w:t>{title}</w:t>
-      </w:r>
-    </w:p>
-    <w:p>
-      <w:r>
-        <w:t>{</w:t>
-      </w:r>
-      <w:proofErr w:type="spellStart"/>
-      <w:r>
-        <w:t>listJoined</w:t>
-      </w:r>
-      <w:proofErr w:type="spellEnd"/>
-      <w:r>
-        <w:t>}</w:t>
-      </w:r>
-    </w:p>
-    <w:p>
-      <w:r>
-        <w:t>{/other}</w:t>
       </w:r>
     </w:p>
     <w:p>
       <w:pPr>
         <w:sectPr>
           <w:type w:val="continuous"/>
-          <w:pgSz w:w="11906" w:h="16838"/>
+          <w:pgSz w:w="12240" w:h="15840" w:code="1"/>
+          <w:pgMar w:top="900" w:right="720" w:bottom="540" w:left="720" w:header="708" w:footer="708" w:gutter="0"/>
+          <w:cols w:space="720"/>
+          <w:docGrid w:linePitch="360"/>
+        </w:sectPr>
+      </w:pPr>
+    </w:p>
+    <w:p>
+      <w:r>
+        <w:t>{#other}</w:t>
+      </w:r>
+    </w:p>
+    <w:p>
+      <w:pPr>
+        <w:pStyle w:val="Heading2"/>
+      </w:pPr>
+      <w:r>
+        <w:t>{title}</w:t>
+      </w:r>
+    </w:p>
+    <w:p>
+      <w:r>
+        <w:t>{</w:t>
+      </w:r>
+      <w:proofErr w:type="spellStart"/>
+      <w:r>
+        <w:t>listJoined</w:t>
+      </w:r>
+      <w:proofErr w:type="spellEnd"/>
+      <w:r>
+        <w:t>}</w:t>
+      </w:r>
+    </w:p>
+    <w:p>
+      <w:r>
+        <w:t>{/other}</w:t>
+      </w:r>
+    </w:p>
+    <w:p>
+      <w:pPr>
+        <w:sectPr>
+          <w:type w:val="continuous"/>
+          <w:pgSz w:w="12240" w:h="15840" w:code="1"/>
           <w:pgMar w:top="900" w:right="720" w:bottom="540" w:left="720" w:header="708" w:footer="708" w:gutter="0"/>
           <w:cols w:num="2" w:space="720"/>
           <w:docGrid w:linePitch="360"/>
@@ -441,29 +439,26 @@
       </w:pPr>
     </w:p>
     <w:p>
-      <w:r>
-        <w:t>{/skills}</w:t>
-      </w:r>
-    </w:p>
-    <w:p>
-      <w:pPr>
-        <w:pStyle w:val="Heading1"/>
-      </w:pPr>
-      <w:r>
-        <w:t>PROFESSIONAL EXPERIENCE</w:t>
-      </w:r>
-    </w:p>
-    <w:p>
-      <w:pPr>
-        <w:pStyle w:val="Heading1"/>
+      <w:pPr>
         <w:sectPr>
           <w:type w:val="continuous"/>
-          <w:pgSz w:w="11906" w:h="16838"/>
+          <w:pgSz w:w="12240" w:h="15840" w:code="1"/>
           <w:pgMar w:top="900" w:right="720" w:bottom="540" w:left="720" w:header="708" w:footer="708" w:gutter="0"/>
           <w:cols w:space="720"/>
           <w:docGrid w:linePitch="360"/>
         </w:sectPr>
       </w:pPr>
+      <w:r>
+        <w:t>{/skills}</w:t>
+      </w:r>
+    </w:p>
+    <w:p>
+      <w:pPr>
+        <w:pStyle w:val="Heading1"/>
+      </w:pPr>
+      <w:r>
+        <w:t>PROFESSIONAL EXPERIENCE</w:t>
+      </w:r>
     </w:p>
     <w:p>
       <w:r>
@@ -574,16 +569,14 @@
         <w:t>{/experience}</w:t>
       </w:r>
     </w:p>
-    <w:p>
-      <w:pPr>
-        <w:pStyle w:val="CompanyInfo"/>
-      </w:pPr>
-    </w:p>
-    <w:p>
-      <w:pPr>
+    <w:p/>
+    <w:p>
+      <w:pPr>
+        <w:pStyle w:val="Heading1"/>
+        <w:keepLines/>
         <w:sectPr>
           <w:type w:val="continuous"/>
-          <w:pgSz w:w="11906" w:h="16838"/>
+          <w:pgSz w:w="12240" w:h="15840" w:code="1"/>
           <w:pgMar w:top="900" w:right="720" w:bottom="540" w:left="720" w:header="708" w:footer="708" w:gutter="0"/>
           <w:cols w:space="720"/>
           <w:docGrid w:linePitch="360"/>
@@ -596,7 +589,6 @@
         <w:keepLines/>
       </w:pPr>
       <w:r>
-        <w:lastRenderedPageBreak/>
         <w:t>SELECTED PROJECTS</w:t>
       </w:r>
     </w:p>
@@ -640,11 +632,6 @@
     <w:p>
       <w:pPr>
         <w:pStyle w:val="ListParagraph"/>
-        <w:numPr>
-          <w:ilvl w:val="0"/>
-          <w:numId w:val="4"/>
-        </w:numPr>
-        <w:ind w:left="360"/>
       </w:pPr>
       <w:proofErr w:type="gramStart"/>
       <w:r>
@@ -671,7 +658,8 @@
       <w:pPr>
         <w:pStyle w:val="Heading1"/>
         <w:sectPr>
-          <w:pgSz w:w="11906" w:h="16838"/>
+          <w:type w:val="continuous"/>
+          <w:pgSz w:w="12240" w:h="15840" w:code="1"/>
           <w:pgMar w:top="900" w:right="720" w:bottom="540" w:left="720" w:header="708" w:footer="708" w:gutter="0"/>
           <w:cols w:space="720"/>
           <w:docGrid w:linePitch="360"/>
@@ -731,7 +719,7 @@
     </w:p>
     <w:sectPr>
       <w:type w:val="continuous"/>
-      <w:pgSz w:w="11906" w:h="16838"/>
+      <w:pgSz w:w="12240" w:h="15840" w:code="1"/>
       <w:pgMar w:top="1034" w:right="720" w:bottom="540" w:left="720" w:header="708" w:footer="708" w:gutter="0"/>
       <w:cols w:space="720"/>
       <w:docGrid w:linePitch="360"/>

</xml_diff>